<commit_message>
Configure section breaks with page numbering starting at Chapter 1 and accurately populate Table of Contents, Figures, and Tables
</commit_message>
<xml_diff>
--- a/report/AI_Generated_Image_Detection_Project_Report.docx
+++ b/report/AI_Generated_Image_Detection_Project_Report.docx
@@ -733,7 +733,7 @@
               <w:rPr>
                 <w:sz w:val="20"/>
               </w:rPr>
-              <w:t>vi – viii</w:t>
+              <w:t>vi – xii</w:t>
             </w:r>
           </w:p>
         </w:tc>
@@ -964,7 +964,7 @@
               <w:rPr>
                 <w:sz w:val="20"/>
               </w:rPr>
-              <w:t>3</w:t>
+              <w:t>2</w:t>
             </w:r>
           </w:p>
         </w:tc>
@@ -1041,7 +1041,7 @@
               <w:rPr>
                 <w:sz w:val="20"/>
               </w:rPr>
-              <w:t>4</w:t>
+              <w:t>3</w:t>
             </w:r>
           </w:p>
         </w:tc>
@@ -1118,7 +1118,7 @@
               <w:rPr>
                 <w:sz w:val="20"/>
               </w:rPr>
-              <w:t>5</w:t>
+              <w:t>3</w:t>
             </w:r>
           </w:p>
         </w:tc>
@@ -1195,7 +1195,7 @@
               <w:rPr>
                 <w:sz w:val="20"/>
               </w:rPr>
-              <w:t>6</w:t>
+              <w:t>4</w:t>
             </w:r>
           </w:p>
         </w:tc>
@@ -1272,7 +1272,7 @@
               <w:rPr>
                 <w:sz w:val="20"/>
               </w:rPr>
-              <w:t>8</w:t>
+              <w:t>6</w:t>
             </w:r>
           </w:p>
         </w:tc>
@@ -1349,7 +1349,7 @@
               <w:rPr>
                 <w:sz w:val="20"/>
               </w:rPr>
-              <w:t>8</w:t>
+              <w:t>6</w:t>
             </w:r>
           </w:p>
         </w:tc>
@@ -1426,7 +1426,7 @@
               <w:rPr>
                 <w:sz w:val="20"/>
               </w:rPr>
-              <w:t>8</w:t>
+              <w:t>6</w:t>
             </w:r>
           </w:p>
         </w:tc>
@@ -1503,7 +1503,7 @@
               <w:rPr>
                 <w:sz w:val="20"/>
               </w:rPr>
-              <w:t>12</w:t>
+              <w:t>7</w:t>
             </w:r>
           </w:p>
         </w:tc>
@@ -1580,7 +1580,7 @@
               <w:rPr>
                 <w:sz w:val="20"/>
               </w:rPr>
-              <w:t>13</w:t>
+              <w:t>8</w:t>
             </w:r>
           </w:p>
         </w:tc>
@@ -1657,7 +1657,7 @@
               <w:rPr>
                 <w:sz w:val="20"/>
               </w:rPr>
-              <w:t>15</w:t>
+              <w:t>9</w:t>
             </w:r>
           </w:p>
         </w:tc>
@@ -1734,7 +1734,7 @@
               <w:rPr>
                 <w:sz w:val="20"/>
               </w:rPr>
-              <w:t>17</w:t>
+              <w:t>11</w:t>
             </w:r>
           </w:p>
         </w:tc>
@@ -1811,7 +1811,7 @@
               <w:rPr>
                 <w:sz w:val="20"/>
               </w:rPr>
-              <w:t>17</w:t>
+              <w:t>11</w:t>
             </w:r>
           </w:p>
         </w:tc>
@@ -1888,7 +1888,7 @@
               <w:rPr>
                 <w:sz w:val="20"/>
               </w:rPr>
-              <w:t>18</w:t>
+              <w:t>11</w:t>
             </w:r>
           </w:p>
         </w:tc>
@@ -1965,7 +1965,7 @@
               <w:rPr>
                 <w:sz w:val="20"/>
               </w:rPr>
-              <w:t>19</w:t>
+              <w:t>12</w:t>
             </w:r>
           </w:p>
         </w:tc>
@@ -2043,7 +2043,7 @@
               <w:rPr>
                 <w:sz w:val="20"/>
               </w:rPr>
-              <w:t>21</w:t>
+              <w:t>13</w:t>
             </w:r>
           </w:p>
         </w:tc>
@@ -2120,7 +2120,7 @@
               <w:rPr>
                 <w:sz w:val="20"/>
               </w:rPr>
-              <w:t>23</w:t>
+              <w:t>15</w:t>
             </w:r>
           </w:p>
         </w:tc>
@@ -2197,7 +2197,7 @@
               <w:rPr>
                 <w:sz w:val="20"/>
               </w:rPr>
-              <w:t>25</w:t>
+              <w:t>15</w:t>
             </w:r>
           </w:p>
         </w:tc>
@@ -2274,7 +2274,7 @@
               <w:rPr>
                 <w:sz w:val="20"/>
               </w:rPr>
-              <w:t>28</w:t>
+              <w:t>16</w:t>
             </w:r>
           </w:p>
         </w:tc>
@@ -2351,7 +2351,7 @@
               <w:rPr>
                 <w:sz w:val="20"/>
               </w:rPr>
-              <w:t>31</w:t>
+              <w:t>18</w:t>
             </w:r>
           </w:p>
         </w:tc>
@@ -2428,7 +2428,7 @@
               <w:rPr>
                 <w:sz w:val="20"/>
               </w:rPr>
-              <w:t>31</w:t>
+              <w:t>18</w:t>
             </w:r>
           </w:p>
         </w:tc>
@@ -2505,7 +2505,7 @@
               <w:rPr>
                 <w:sz w:val="20"/>
               </w:rPr>
-              <w:t>33</w:t>
+              <w:t>19</w:t>
             </w:r>
           </w:p>
         </w:tc>
@@ -2582,7 +2582,7 @@
               <w:rPr>
                 <w:sz w:val="20"/>
               </w:rPr>
-              <w:t>34</w:t>
+              <w:t>20</w:t>
             </w:r>
           </w:p>
         </w:tc>
@@ -2659,7 +2659,7 @@
               <w:rPr>
                 <w:sz w:val="20"/>
               </w:rPr>
-              <w:t>36</w:t>
+              <w:t>20</w:t>
             </w:r>
           </w:p>
         </w:tc>
@@ -2736,7 +2736,7 @@
               <w:rPr>
                 <w:sz w:val="20"/>
               </w:rPr>
-              <w:t>37</w:t>
+              <w:t>21</w:t>
             </w:r>
           </w:p>
         </w:tc>
@@ -2813,7 +2813,7 @@
               <w:rPr>
                 <w:sz w:val="20"/>
               </w:rPr>
-              <w:t>39</w:t>
+              <w:t>22</w:t>
             </w:r>
           </w:p>
         </w:tc>
@@ -2890,7 +2890,7 @@
               <w:rPr>
                 <w:sz w:val="20"/>
               </w:rPr>
-              <w:t>41</w:t>
+              <w:t>22</w:t>
             </w:r>
           </w:p>
         </w:tc>
@@ -2967,7 +2967,7 @@
               <w:rPr>
                 <w:sz w:val="20"/>
               </w:rPr>
-              <w:t>44</w:t>
+              <w:t>24</w:t>
             </w:r>
           </w:p>
         </w:tc>
@@ -3044,7 +3044,7 @@
               <w:rPr>
                 <w:sz w:val="20"/>
               </w:rPr>
-              <w:t>44</w:t>
+              <w:t>24</w:t>
             </w:r>
           </w:p>
         </w:tc>
@@ -3121,7 +3121,7 @@
               <w:rPr>
                 <w:sz w:val="20"/>
               </w:rPr>
-              <w:t>45</w:t>
+              <w:t>24</w:t>
             </w:r>
           </w:p>
         </w:tc>
@@ -3198,7 +3198,7 @@
               <w:rPr>
                 <w:sz w:val="20"/>
               </w:rPr>
-              <w:t>47</w:t>
+              <w:t>24</w:t>
             </w:r>
           </w:p>
         </w:tc>
@@ -3275,7 +3275,7 @@
               <w:rPr>
                 <w:sz w:val="20"/>
               </w:rPr>
-              <w:t>50</w:t>
+              <w:t>25</w:t>
             </w:r>
           </w:p>
         </w:tc>
@@ -3352,7 +3352,7 @@
               <w:rPr>
                 <w:sz w:val="20"/>
               </w:rPr>
-              <w:t>52</w:t>
+              <w:t>26</w:t>
             </w:r>
           </w:p>
         </w:tc>
@@ -3429,7 +3429,7 @@
               <w:rPr>
                 <w:sz w:val="20"/>
               </w:rPr>
-              <w:t>54</w:t>
+              <w:t>26</w:t>
             </w:r>
           </w:p>
         </w:tc>
@@ -3506,7 +3506,7 @@
               <w:rPr>
                 <w:sz w:val="20"/>
               </w:rPr>
-              <w:t>56</w:t>
+              <w:t>28</w:t>
             </w:r>
           </w:p>
         </w:tc>
@@ -3584,7 +3584,7 @@
               <w:rPr>
                 <w:sz w:val="20"/>
               </w:rPr>
-              <w:t>56</w:t>
+              <w:t>28</w:t>
             </w:r>
           </w:p>
         </w:tc>
@@ -3661,7 +3661,7 @@
               <w:rPr>
                 <w:sz w:val="20"/>
               </w:rPr>
-              <w:t>57</w:t>
+              <w:t>28</w:t>
             </w:r>
           </w:p>
         </w:tc>
@@ -3738,7 +3738,7 @@
               <w:rPr>
                 <w:sz w:val="20"/>
               </w:rPr>
-              <w:t>59</w:t>
+              <w:t>29</w:t>
             </w:r>
           </w:p>
         </w:tc>
@@ -3815,7 +3815,7 @@
               <w:rPr>
                 <w:sz w:val="20"/>
               </w:rPr>
-              <w:t>61</w:t>
+              <w:t>30</w:t>
             </w:r>
           </w:p>
         </w:tc>
@@ -3892,7 +3892,7 @@
               <w:rPr>
                 <w:sz w:val="20"/>
               </w:rPr>
-              <w:t>62</w:t>
+              <w:t>31</w:t>
             </w:r>
           </w:p>
         </w:tc>
@@ -3969,7 +3969,7 @@
               <w:rPr>
                 <w:sz w:val="20"/>
               </w:rPr>
-              <w:t>64</w:t>
+              <w:t>32</w:t>
             </w:r>
           </w:p>
         </w:tc>
@@ -4046,7 +4046,7 @@
               <w:rPr>
                 <w:sz w:val="20"/>
               </w:rPr>
-              <w:t>67</w:t>
+              <w:t>33</w:t>
             </w:r>
           </w:p>
         </w:tc>
@@ -4123,7 +4123,7 @@
               <w:rPr>
                 <w:sz w:val="20"/>
               </w:rPr>
-              <w:t>67</w:t>
+              <w:t>33</w:t>
             </w:r>
           </w:p>
         </w:tc>
@@ -4200,7 +4200,7 @@
               <w:rPr>
                 <w:sz w:val="20"/>
               </w:rPr>
-              <w:t>68</w:t>
+              <w:t>33</w:t>
             </w:r>
           </w:p>
         </w:tc>
@@ -4277,7 +4277,7 @@
               <w:rPr>
                 <w:sz w:val="20"/>
               </w:rPr>
-              <w:t>69</w:t>
+              <w:t>34</w:t>
             </w:r>
           </w:p>
         </w:tc>
@@ -4354,7 +4354,7 @@
               <w:rPr>
                 <w:sz w:val="20"/>
               </w:rPr>
-              <w:t>70</w:t>
+              <w:t>34</w:t>
             </w:r>
           </w:p>
         </w:tc>
@@ -4431,7 +4431,7 @@
               <w:rPr>
                 <w:sz w:val="20"/>
               </w:rPr>
-              <w:t>72</w:t>
+              <w:t>36</w:t>
             </w:r>
           </w:p>
         </w:tc>
@@ -4508,7 +4508,7 @@
               <w:rPr>
                 <w:sz w:val="20"/>
               </w:rPr>
-              <w:t>75</w:t>
+              <w:t>38</w:t>
             </w:r>
           </w:p>
         </w:tc>
@@ -4585,7 +4585,7 @@
               <w:rPr>
                 <w:sz w:val="20"/>
               </w:rPr>
-              <w:t>78</w:t>
+              <w:t>40</w:t>
             </w:r>
           </w:p>
         </w:tc>
@@ -4662,7 +4662,7 @@
               <w:rPr>
                 <w:sz w:val="20"/>
               </w:rPr>
-              <w:t>80</w:t>
+              <w:t>42</w:t>
             </w:r>
           </w:p>
         </w:tc>
@@ -4739,7 +4739,7 @@
               <w:rPr>
                 <w:sz w:val="20"/>
               </w:rPr>
-              <w:t>83</w:t>
+              <w:t>44</w:t>
             </w:r>
           </w:p>
         </w:tc>
@@ -4942,7 +4942,7 @@
               <w:rPr>
                 <w:sz w:val="20"/>
               </w:rPr>
-              <w:t>24</w:t>
+              <w:t>15</w:t>
             </w:r>
           </w:p>
         </w:tc>
@@ -4995,7 +4995,7 @@
               <w:rPr>
                 <w:sz w:val="20"/>
               </w:rPr>
-              <w:t>Mermaid workflow of the model training and validation pipeline</w:t>
+              <w:t>Architectural workflow of model training, validation, and serialization</w:t>
             </w:r>
           </w:p>
         </w:tc>
@@ -5019,7 +5019,7 @@
               <w:rPr>
                 <w:sz w:val="20"/>
               </w:rPr>
-              <w:t>26</w:t>
+              <w:t>16</w:t>
             </w:r>
           </w:p>
         </w:tc>
@@ -5096,7 +5096,7 @@
               <w:rPr>
                 <w:sz w:val="20"/>
               </w:rPr>
-              <w:t>27</w:t>
+              <w:t>16</w:t>
             </w:r>
           </w:p>
         </w:tc>
@@ -5173,7 +5173,7 @@
               <w:rPr>
                 <w:sz w:val="20"/>
               </w:rPr>
-              <w:t>29</w:t>
+              <w:t>17</w:t>
             </w:r>
           </w:p>
         </w:tc>
@@ -5250,7 +5250,7 @@
               <w:rPr>
                 <w:sz w:val="20"/>
               </w:rPr>
-              <w:t>32</w:t>
+              <w:t>18</w:t>
             </w:r>
           </w:p>
         </w:tc>
@@ -5262,55 +5262,55 @@
         <w:tc>
           <w:tcPr>
             <w:tcW w:w="1728" w:type="dxa"/>
-            <w:shd w:val="clear" w:color="auto" w:fill="F5F8FA"/>
-            <w:tcMar>
-              <w:top w:w="100" w:type="dxa"/>
-              <w:left w:w="140" w:type="dxa"/>
-              <w:bottom w:w="100" w:type="dxa"/>
-              <w:right w:w="140" w:type="dxa"/>
-            </w:tcMar>
-          </w:tcPr>
-          <w:p>
-            <w:pPr>
-              <w:spacing w:line="276" w:lineRule="auto"/>
-              <w:jc w:val="left"/>
-            </w:pPr>
-            <w:r>
-              <w:rPr>
-                <w:sz w:val="20"/>
-              </w:rPr>
-              <w:t>Figure 4.2</w:t>
+            <w:shd w:val="clear" w:color="auto" w:fill="FFFFFF"/>
+            <w:tcMar>
+              <w:top w:w="100" w:type="dxa"/>
+              <w:left w:w="140" w:type="dxa"/>
+              <w:bottom w:w="100" w:type="dxa"/>
+              <w:right w:w="140" w:type="dxa"/>
+            </w:tcMar>
+          </w:tcPr>
+          <w:p>
+            <w:pPr>
+              <w:spacing w:line="276" w:lineRule="auto"/>
+              <w:jc w:val="left"/>
+            </w:pPr>
+            <w:r>
+              <w:rPr>
+                <w:sz w:val="20"/>
+              </w:rPr>
+              <w:t>Figure 5.1</w:t>
             </w:r>
           </w:p>
         </w:tc>
         <w:tc>
           <w:tcPr>
             <w:tcW w:w="5760" w:type="dxa"/>
-            <w:shd w:val="clear" w:color="auto" w:fill="F5F8FA"/>
-            <w:tcMar>
-              <w:top w:w="100" w:type="dxa"/>
-              <w:left w:w="140" w:type="dxa"/>
-              <w:bottom w:w="100" w:type="dxa"/>
-              <w:right w:w="140" w:type="dxa"/>
-            </w:tcMar>
-          </w:tcPr>
-          <w:p>
-            <w:pPr>
-              <w:spacing w:line="276" w:lineRule="auto"/>
-              <w:jc w:val="left"/>
-            </w:pPr>
-            <w:r>
-              <w:rPr>
-                <w:sz w:val="20"/>
-              </w:rPr>
-              <w:t>Image tensor normalization and feature transformation flow</w:t>
+            <w:shd w:val="clear" w:color="auto" w:fill="FFFFFF"/>
+            <w:tcMar>
+              <w:top w:w="100" w:type="dxa"/>
+              <w:left w:w="140" w:type="dxa"/>
+              <w:bottom w:w="100" w:type="dxa"/>
+              <w:right w:w="140" w:type="dxa"/>
+            </w:tcMar>
+          </w:tcPr>
+          <w:p>
+            <w:pPr>
+              <w:spacing w:line="276" w:lineRule="auto"/>
+              <w:jc w:val="left"/>
+            </w:pPr>
+            <w:r>
+              <w:rPr>
+                <w:sz w:val="20"/>
+              </w:rPr>
+              <w:t>Live Streamlit interactive graphical web interface for image authenticity verification</w:t>
             </w:r>
           </w:p>
         </w:tc>
         <w:tc>
           <w:tcPr>
             <w:tcW w:w="1008" w:type="dxa"/>
-            <w:shd w:val="clear" w:color="auto" w:fill="F5F8FA"/>
+            <w:shd w:val="clear" w:color="auto" w:fill="FFFFFF"/>
             <w:tcMar>
               <w:top w:w="100" w:type="dxa"/>
               <w:left w:w="140" w:type="dxa"/>
@@ -5327,7 +5327,7 @@
               <w:rPr>
                 <w:sz w:val="20"/>
               </w:rPr>
-              <w:t>35</w:t>
+              <w:t>27</w:t>
             </w:r>
           </w:p>
         </w:tc>
@@ -5339,55 +5339,55 @@
         <w:tc>
           <w:tcPr>
             <w:tcW w:w="1728" w:type="dxa"/>
-            <w:shd w:val="clear" w:color="auto" w:fill="FFFFFF"/>
-            <w:tcMar>
-              <w:top w:w="100" w:type="dxa"/>
-              <w:left w:w="140" w:type="dxa"/>
-              <w:bottom w:w="100" w:type="dxa"/>
-              <w:right w:w="140" w:type="dxa"/>
-            </w:tcMar>
-          </w:tcPr>
-          <w:p>
-            <w:pPr>
-              <w:spacing w:line="276" w:lineRule="auto"/>
-              <w:jc w:val="left"/>
-            </w:pPr>
-            <w:r>
-              <w:rPr>
-                <w:sz w:val="20"/>
-              </w:rPr>
-              <w:t>Figure 5.1</w:t>
+            <w:shd w:val="clear" w:color="auto" w:fill="F5F8FA"/>
+            <w:tcMar>
+              <w:top w:w="100" w:type="dxa"/>
+              <w:left w:w="140" w:type="dxa"/>
+              <w:bottom w:w="100" w:type="dxa"/>
+              <w:right w:w="140" w:type="dxa"/>
+            </w:tcMar>
+          </w:tcPr>
+          <w:p>
+            <w:pPr>
+              <w:spacing w:line="276" w:lineRule="auto"/>
+              <w:jc w:val="left"/>
+            </w:pPr>
+            <w:r>
+              <w:rPr>
+                <w:sz w:val="20"/>
+              </w:rPr>
+              <w:t>Figure 6.1</w:t>
             </w:r>
           </w:p>
         </w:tc>
         <w:tc>
           <w:tcPr>
             <w:tcW w:w="5760" w:type="dxa"/>
-            <w:shd w:val="clear" w:color="auto" w:fill="FFFFFF"/>
-            <w:tcMar>
-              <w:top w:w="100" w:type="dxa"/>
-              <w:left w:w="140" w:type="dxa"/>
-              <w:bottom w:w="100" w:type="dxa"/>
-              <w:right w:w="140" w:type="dxa"/>
-            </w:tcMar>
-          </w:tcPr>
-          <w:p>
-            <w:pPr>
-              <w:spacing w:line="276" w:lineRule="auto"/>
-              <w:jc w:val="left"/>
-            </w:pPr>
-            <w:r>
-              <w:rPr>
-                <w:sz w:val="20"/>
-              </w:rPr>
-              <w:t>Streamlit interactive graphical web interface for image authenticity verification</w:t>
+            <w:shd w:val="clear" w:color="auto" w:fill="F5F8FA"/>
+            <w:tcMar>
+              <w:top w:w="100" w:type="dxa"/>
+              <w:left w:w="140" w:type="dxa"/>
+              <w:bottom w:w="100" w:type="dxa"/>
+              <w:right w:w="140" w:type="dxa"/>
+            </w:tcMar>
+          </w:tcPr>
+          <w:p>
+            <w:pPr>
+              <w:spacing w:line="276" w:lineRule="auto"/>
+              <w:jc w:val="left"/>
+            </w:pPr>
+            <w:r>
+              <w:rPr>
+                <w:sz w:val="20"/>
+              </w:rPr>
+              <w:t>Training and validation accuracy progression over training epochs</w:t>
             </w:r>
           </w:p>
         </w:tc>
         <w:tc>
           <w:tcPr>
             <w:tcW w:w="1008" w:type="dxa"/>
-            <w:shd w:val="clear" w:color="auto" w:fill="FFFFFF"/>
+            <w:shd w:val="clear" w:color="auto" w:fill="F5F8FA"/>
             <w:tcMar>
               <w:top w:w="100" w:type="dxa"/>
               <w:left w:w="140" w:type="dxa"/>
@@ -5404,7 +5404,7 @@
               <w:rPr>
                 <w:sz w:val="20"/>
               </w:rPr>
-              <w:t>55</w:t>
+              <w:t>29</w:t>
             </w:r>
           </w:p>
         </w:tc>
@@ -5416,55 +5416,55 @@
         <w:tc>
           <w:tcPr>
             <w:tcW w:w="1728" w:type="dxa"/>
-            <w:shd w:val="clear" w:color="auto" w:fill="F5F8FA"/>
-            <w:tcMar>
-              <w:top w:w="100" w:type="dxa"/>
-              <w:left w:w="140" w:type="dxa"/>
-              <w:bottom w:w="100" w:type="dxa"/>
-              <w:right w:w="140" w:type="dxa"/>
-            </w:tcMar>
-          </w:tcPr>
-          <w:p>
-            <w:pPr>
-              <w:spacing w:line="276" w:lineRule="auto"/>
-              <w:jc w:val="left"/>
-            </w:pPr>
-            <w:r>
-              <w:rPr>
-                <w:sz w:val="20"/>
-              </w:rPr>
-              <w:t>Figure 6.1</w:t>
+            <w:shd w:val="clear" w:color="auto" w:fill="FFFFFF"/>
+            <w:tcMar>
+              <w:top w:w="100" w:type="dxa"/>
+              <w:left w:w="140" w:type="dxa"/>
+              <w:bottom w:w="100" w:type="dxa"/>
+              <w:right w:w="140" w:type="dxa"/>
+            </w:tcMar>
+          </w:tcPr>
+          <w:p>
+            <w:pPr>
+              <w:spacing w:line="276" w:lineRule="auto"/>
+              <w:jc w:val="left"/>
+            </w:pPr>
+            <w:r>
+              <w:rPr>
+                <w:sz w:val="20"/>
+              </w:rPr>
+              <w:t>Figure 6.2</w:t>
             </w:r>
           </w:p>
         </w:tc>
         <w:tc>
           <w:tcPr>
             <w:tcW w:w="5760" w:type="dxa"/>
-            <w:shd w:val="clear" w:color="auto" w:fill="F5F8FA"/>
-            <w:tcMar>
-              <w:top w:w="100" w:type="dxa"/>
-              <w:left w:w="140" w:type="dxa"/>
-              <w:bottom w:w="100" w:type="dxa"/>
-              <w:right w:w="140" w:type="dxa"/>
-            </w:tcMar>
-          </w:tcPr>
-          <w:p>
-            <w:pPr>
-              <w:spacing w:line="276" w:lineRule="auto"/>
-              <w:jc w:val="left"/>
-            </w:pPr>
-            <w:r>
-              <w:rPr>
-                <w:sz w:val="20"/>
-              </w:rPr>
-              <w:t>Training and validation accuracy progression over training epochs</w:t>
+            <w:shd w:val="clear" w:color="auto" w:fill="FFFFFF"/>
+            <w:tcMar>
+              <w:top w:w="100" w:type="dxa"/>
+              <w:left w:w="140" w:type="dxa"/>
+              <w:bottom w:w="100" w:type="dxa"/>
+              <w:right w:w="140" w:type="dxa"/>
+            </w:tcMar>
+          </w:tcPr>
+          <w:p>
+            <w:pPr>
+              <w:spacing w:line="276" w:lineRule="auto"/>
+              <w:jc w:val="left"/>
+            </w:pPr>
+            <w:r>
+              <w:rPr>
+                <w:sz w:val="20"/>
+              </w:rPr>
+              <w:t>Training and validation binary cross-entropy loss trajectories</w:t>
             </w:r>
           </w:p>
         </w:tc>
         <w:tc>
           <w:tcPr>
             <w:tcW w:w="1008" w:type="dxa"/>
-            <w:shd w:val="clear" w:color="auto" w:fill="F5F8FA"/>
+            <w:shd w:val="clear" w:color="auto" w:fill="FFFFFF"/>
             <w:tcMar>
               <w:top w:w="100" w:type="dxa"/>
               <w:left w:w="140" w:type="dxa"/>
@@ -5481,7 +5481,7 @@
               <w:rPr>
                 <w:sz w:val="20"/>
               </w:rPr>
-              <w:t>58</w:t>
+              <w:t>29</w:t>
             </w:r>
           </w:p>
         </w:tc>
@@ -5493,55 +5493,55 @@
         <w:tc>
           <w:tcPr>
             <w:tcW w:w="1728" w:type="dxa"/>
-            <w:shd w:val="clear" w:color="auto" w:fill="FFFFFF"/>
-            <w:tcMar>
-              <w:top w:w="100" w:type="dxa"/>
-              <w:left w:w="140" w:type="dxa"/>
-              <w:bottom w:w="100" w:type="dxa"/>
-              <w:right w:w="140" w:type="dxa"/>
-            </w:tcMar>
-          </w:tcPr>
-          <w:p>
-            <w:pPr>
-              <w:spacing w:line="276" w:lineRule="auto"/>
-              <w:jc w:val="left"/>
-            </w:pPr>
-            <w:r>
-              <w:rPr>
-                <w:sz w:val="20"/>
-              </w:rPr>
-              <w:t>Figure 6.2</w:t>
+            <w:shd w:val="clear" w:color="auto" w:fill="F5F8FA"/>
+            <w:tcMar>
+              <w:top w:w="100" w:type="dxa"/>
+              <w:left w:w="140" w:type="dxa"/>
+              <w:bottom w:w="100" w:type="dxa"/>
+              <w:right w:w="140" w:type="dxa"/>
+            </w:tcMar>
+          </w:tcPr>
+          <w:p>
+            <w:pPr>
+              <w:spacing w:line="276" w:lineRule="auto"/>
+              <w:jc w:val="left"/>
+            </w:pPr>
+            <w:r>
+              <w:rPr>
+                <w:sz w:val="20"/>
+              </w:rPr>
+              <w:t>Figure 6.3</w:t>
             </w:r>
           </w:p>
         </w:tc>
         <w:tc>
           <w:tcPr>
             <w:tcW w:w="5760" w:type="dxa"/>
-            <w:shd w:val="clear" w:color="auto" w:fill="FFFFFF"/>
-            <w:tcMar>
-              <w:top w:w="100" w:type="dxa"/>
-              <w:left w:w="140" w:type="dxa"/>
-              <w:bottom w:w="100" w:type="dxa"/>
-              <w:right w:w="140" w:type="dxa"/>
-            </w:tcMar>
-          </w:tcPr>
-          <w:p>
-            <w:pPr>
-              <w:spacing w:line="276" w:lineRule="auto"/>
-              <w:jc w:val="left"/>
-            </w:pPr>
-            <w:r>
-              <w:rPr>
-                <w:sz w:val="20"/>
-              </w:rPr>
-              <w:t>Training and validation binary cross-entropy loss trajectories</w:t>
+            <w:shd w:val="clear" w:color="auto" w:fill="F5F8FA"/>
+            <w:tcMar>
+              <w:top w:w="100" w:type="dxa"/>
+              <w:left w:w="140" w:type="dxa"/>
+              <w:bottom w:w="100" w:type="dxa"/>
+              <w:right w:w="140" w:type="dxa"/>
+            </w:tcMar>
+          </w:tcPr>
+          <w:p>
+            <w:pPr>
+              <w:spacing w:line="276" w:lineRule="auto"/>
+              <w:jc w:val="left"/>
+            </w:pPr>
+            <w:r>
+              <w:rPr>
+                <w:sz w:val="20"/>
+              </w:rPr>
+              <w:t>Confusion matrix of MobileNetV2 classifier on held-out CIFAKE test split</w:t>
             </w:r>
           </w:p>
         </w:tc>
         <w:tc>
           <w:tcPr>
             <w:tcW w:w="1008" w:type="dxa"/>
-            <w:shd w:val="clear" w:color="auto" w:fill="FFFFFF"/>
+            <w:shd w:val="clear" w:color="auto" w:fill="F5F8FA"/>
             <w:tcMar>
               <w:top w:w="100" w:type="dxa"/>
               <w:left w:w="140" w:type="dxa"/>
@@ -5558,7 +5558,7 @@
               <w:rPr>
                 <w:sz w:val="20"/>
               </w:rPr>
-              <w:t>58</w:t>
+              <w:t>30</w:t>
             </w:r>
           </w:p>
         </w:tc>
@@ -5570,55 +5570,55 @@
         <w:tc>
           <w:tcPr>
             <w:tcW w:w="1728" w:type="dxa"/>
-            <w:shd w:val="clear" w:color="auto" w:fill="F5F8FA"/>
-            <w:tcMar>
-              <w:top w:w="100" w:type="dxa"/>
-              <w:left w:w="140" w:type="dxa"/>
-              <w:bottom w:w="100" w:type="dxa"/>
-              <w:right w:w="140" w:type="dxa"/>
-            </w:tcMar>
-          </w:tcPr>
-          <w:p>
-            <w:pPr>
-              <w:spacing w:line="276" w:lineRule="auto"/>
-              <w:jc w:val="left"/>
-            </w:pPr>
-            <w:r>
-              <w:rPr>
-                <w:sz w:val="20"/>
-              </w:rPr>
-              <w:t>Figure 6.3</w:t>
+            <w:shd w:val="clear" w:color="auto" w:fill="FFFFFF"/>
+            <w:tcMar>
+              <w:top w:w="100" w:type="dxa"/>
+              <w:left w:w="140" w:type="dxa"/>
+              <w:bottom w:w="100" w:type="dxa"/>
+              <w:right w:w="140" w:type="dxa"/>
+            </w:tcMar>
+          </w:tcPr>
+          <w:p>
+            <w:pPr>
+              <w:spacing w:line="276" w:lineRule="auto"/>
+              <w:jc w:val="left"/>
+            </w:pPr>
+            <w:r>
+              <w:rPr>
+                <w:sz w:val="20"/>
+              </w:rPr>
+              <w:t>Figure 6.4</w:t>
             </w:r>
           </w:p>
         </w:tc>
         <w:tc>
           <w:tcPr>
             <w:tcW w:w="5760" w:type="dxa"/>
-            <w:shd w:val="clear" w:color="auto" w:fill="F5F8FA"/>
-            <w:tcMar>
-              <w:top w:w="100" w:type="dxa"/>
-              <w:left w:w="140" w:type="dxa"/>
-              <w:bottom w:w="100" w:type="dxa"/>
-              <w:right w:w="140" w:type="dxa"/>
-            </w:tcMar>
-          </w:tcPr>
-          <w:p>
-            <w:pPr>
-              <w:spacing w:line="276" w:lineRule="auto"/>
-              <w:jc w:val="left"/>
-            </w:pPr>
-            <w:r>
-              <w:rPr>
-                <w:sz w:val="20"/>
-              </w:rPr>
-              <w:t>Confusion matrix of MobileNetV2 classifier on held-out CIFAKE test split</w:t>
+            <w:shd w:val="clear" w:color="auto" w:fill="FFFFFF"/>
+            <w:tcMar>
+              <w:top w:w="100" w:type="dxa"/>
+              <w:left w:w="140" w:type="dxa"/>
+              <w:bottom w:w="100" w:type="dxa"/>
+              <w:right w:w="140" w:type="dxa"/>
+            </w:tcMar>
+          </w:tcPr>
+          <w:p>
+            <w:pPr>
+              <w:spacing w:line="276" w:lineRule="auto"/>
+              <w:jc w:val="left"/>
+            </w:pPr>
+            <w:r>
+              <w:rPr>
+                <w:sz w:val="20"/>
+              </w:rPr>
+              <w:t>Receiver Operating Characteristic (ROC) curve showing Area Under Curve (AUC = 0.9824)</w:t>
             </w:r>
           </w:p>
         </w:tc>
         <w:tc>
           <w:tcPr>
             <w:tcW w:w="1008" w:type="dxa"/>
-            <w:shd w:val="clear" w:color="auto" w:fill="F5F8FA"/>
+            <w:shd w:val="clear" w:color="auto" w:fill="FFFFFF"/>
             <w:tcMar>
               <w:top w:w="100" w:type="dxa"/>
               <w:left w:w="140" w:type="dxa"/>
@@ -5635,7 +5635,7 @@
               <w:rPr>
                 <w:sz w:val="20"/>
               </w:rPr>
-              <w:t>60</w:t>
+              <w:t>31</w:t>
             </w:r>
           </w:p>
         </w:tc>
@@ -5664,7 +5664,7 @@
               <w:rPr>
                 <w:sz w:val="20"/>
               </w:rPr>
-              <w:t>Figure 6.4</w:t>
+              <w:t>Figure B.1</w:t>
             </w:r>
           </w:p>
         </w:tc>
@@ -5688,7 +5688,7 @@
               <w:rPr>
                 <w:sz w:val="20"/>
               </w:rPr>
-              <w:t>Receiver Operating Characteristic (ROC) curve showing Area Under Curve (AUC)</w:t>
+              <w:t>Live Streamlit technical breakdown and confidence distribution dashboard</w:t>
             </w:r>
           </w:p>
         </w:tc>
@@ -5712,161 +5712,7 @@
               <w:rPr>
                 <w:sz w:val="20"/>
               </w:rPr>
-              <w:t>61</w:t>
-            </w:r>
-          </w:p>
-        </w:tc>
-      </w:tr>
-      <w:tr>
-        <w:trPr>
-          <w:jc w:val="center"/>
-        </w:trPr>
-        <w:tc>
-          <w:tcPr>
-            <w:tcW w:w="1728" w:type="dxa"/>
-            <w:shd w:val="clear" w:color="auto" w:fill="F5F8FA"/>
-            <w:tcMar>
-              <w:top w:w="100" w:type="dxa"/>
-              <w:left w:w="140" w:type="dxa"/>
-              <w:bottom w:w="100" w:type="dxa"/>
-              <w:right w:w="140" w:type="dxa"/>
-            </w:tcMar>
-          </w:tcPr>
-          <w:p>
-            <w:pPr>
-              <w:spacing w:line="276" w:lineRule="auto"/>
-              <w:jc w:val="left"/>
-            </w:pPr>
-            <w:r>
-              <w:rPr>
-                <w:sz w:val="20"/>
-              </w:rPr>
-              <w:t>Figure 6.5</w:t>
-            </w:r>
-          </w:p>
-        </w:tc>
-        <w:tc>
-          <w:tcPr>
-            <w:tcW w:w="5760" w:type="dxa"/>
-            <w:shd w:val="clear" w:color="auto" w:fill="F5F8FA"/>
-            <w:tcMar>
-              <w:top w:w="100" w:type="dxa"/>
-              <w:left w:w="140" w:type="dxa"/>
-              <w:bottom w:w="100" w:type="dxa"/>
-              <w:right w:w="140" w:type="dxa"/>
-            </w:tcMar>
-          </w:tcPr>
-          <w:p>
-            <w:pPr>
-              <w:spacing w:line="276" w:lineRule="auto"/>
-              <w:jc w:val="left"/>
-            </w:pPr>
-            <w:r>
-              <w:rPr>
-                <w:sz w:val="20"/>
-              </w:rPr>
-              <w:t>Visual categorization of correct classifications and edge-case misclassifications</w:t>
-            </w:r>
-          </w:p>
-        </w:tc>
-        <w:tc>
-          <w:tcPr>
-            <w:tcW w:w="1008" w:type="dxa"/>
-            <w:shd w:val="clear" w:color="auto" w:fill="F5F8FA"/>
-            <w:tcMar>
-              <w:top w:w="100" w:type="dxa"/>
-              <w:left w:w="140" w:type="dxa"/>
-              <w:bottom w:w="100" w:type="dxa"/>
-              <w:right w:w="140" w:type="dxa"/>
-            </w:tcMar>
-          </w:tcPr>
-          <w:p>
-            <w:pPr>
-              <w:spacing w:line="276" w:lineRule="auto"/>
-              <w:jc w:val="center"/>
-            </w:pPr>
-            <w:r>
-              <w:rPr>
-                <w:sz w:val="20"/>
-              </w:rPr>
-              <w:t>63</w:t>
-            </w:r>
-          </w:p>
-        </w:tc>
-      </w:tr>
-      <w:tr>
-        <w:trPr>
-          <w:jc w:val="center"/>
-        </w:trPr>
-        <w:tc>
-          <w:tcPr>
-            <w:tcW w:w="1728" w:type="dxa"/>
-            <w:shd w:val="clear" w:color="auto" w:fill="FFFFFF"/>
-            <w:tcMar>
-              <w:top w:w="100" w:type="dxa"/>
-              <w:left w:w="140" w:type="dxa"/>
-              <w:bottom w:w="100" w:type="dxa"/>
-              <w:right w:w="140" w:type="dxa"/>
-            </w:tcMar>
-          </w:tcPr>
-          <w:p>
-            <w:pPr>
-              <w:spacing w:line="276" w:lineRule="auto"/>
-              <w:jc w:val="left"/>
-            </w:pPr>
-            <w:r>
-              <w:rPr>
-                <w:sz w:val="20"/>
-              </w:rPr>
-              <w:t>Figure B.1</w:t>
-            </w:r>
-          </w:p>
-        </w:tc>
-        <w:tc>
-          <w:tcPr>
-            <w:tcW w:w="5760" w:type="dxa"/>
-            <w:shd w:val="clear" w:color="auto" w:fill="FFFFFF"/>
-            <w:tcMar>
-              <w:top w:w="100" w:type="dxa"/>
-              <w:left w:w="140" w:type="dxa"/>
-              <w:bottom w:w="100" w:type="dxa"/>
-              <w:right w:w="140" w:type="dxa"/>
-            </w:tcMar>
-          </w:tcPr>
-          <w:p>
-            <w:pPr>
-              <w:spacing w:line="276" w:lineRule="auto"/>
-              <w:jc w:val="left"/>
-            </w:pPr>
-            <w:r>
-              <w:rPr>
-                <w:sz w:val="20"/>
-              </w:rPr>
-              <w:t>CLI real-time inference execution log on sample validation image</w:t>
-            </w:r>
-          </w:p>
-        </w:tc>
-        <w:tc>
-          <w:tcPr>
-            <w:tcW w:w="1008" w:type="dxa"/>
-            <w:shd w:val="clear" w:color="auto" w:fill="FFFFFF"/>
-            <w:tcMar>
-              <w:top w:w="100" w:type="dxa"/>
-              <w:left w:w="140" w:type="dxa"/>
-              <w:bottom w:w="100" w:type="dxa"/>
-              <w:right w:w="140" w:type="dxa"/>
-            </w:tcMar>
-          </w:tcPr>
-          <w:p>
-            <w:pPr>
-              <w:spacing w:line="276" w:lineRule="auto"/>
-              <w:jc w:val="center"/>
-            </w:pPr>
-            <w:r>
-              <w:rPr>
-                <w:sz w:val="20"/>
-              </w:rPr>
-              <w:t>79</w:t>
+              <w:t>40</w:t>
             </w:r>
           </w:p>
         </w:tc>
@@ -6069,7 +5915,7 @@
               <w:rPr>
                 <w:sz w:val="20"/>
               </w:rPr>
-              <w:t>12</w:t>
+              <w:t>7</w:t>
             </w:r>
           </w:p>
         </w:tc>
@@ -6146,7 +5992,7 @@
               <w:rPr>
                 <w:sz w:val="20"/>
               </w:rPr>
-              <w:t>20</w:t>
+              <w:t>12</w:t>
             </w:r>
           </w:p>
         </w:tc>
@@ -6223,7 +6069,7 @@
               <w:rPr>
                 <w:sz w:val="20"/>
               </w:rPr>
-              <w:t>21</w:t>
+              <w:t>13</w:t>
             </w:r>
           </w:p>
         </w:tc>
@@ -6300,7 +6146,7 @@
               <w:rPr>
                 <w:sz w:val="20"/>
               </w:rPr>
-              <w:t>22</w:t>
+              <w:t>13</w:t>
             </w:r>
           </w:p>
         </w:tc>
@@ -6377,7 +6223,7 @@
               <w:rPr>
                 <w:sz w:val="20"/>
               </w:rPr>
-              <w:t>23</w:t>
+              <w:t>14</w:t>
             </w:r>
           </w:p>
         </w:tc>
@@ -6454,7 +6300,7 @@
               <w:rPr>
                 <w:sz w:val="20"/>
               </w:rPr>
-              <w:t>33</w:t>
+              <w:t>18</w:t>
             </w:r>
           </w:p>
         </w:tc>
@@ -6531,7 +6377,7 @@
               <w:rPr>
                 <w:sz w:val="20"/>
               </w:rPr>
-              <w:t>38</w:t>
+              <w:t>21</w:t>
             </w:r>
           </w:p>
         </w:tc>
@@ -6608,7 +6454,7 @@
               <w:rPr>
                 <w:sz w:val="20"/>
               </w:rPr>
-              <w:t>40</w:t>
+              <w:t>22</w:t>
             </w:r>
           </w:p>
         </w:tc>
@@ -6685,7 +6531,7 @@
               <w:rPr>
                 <w:sz w:val="20"/>
               </w:rPr>
-              <w:t>48</w:t>
+              <w:t>24</w:t>
             </w:r>
           </w:p>
         </w:tc>
@@ -6762,7 +6608,7 @@
               <w:rPr>
                 <w:sz w:val="20"/>
               </w:rPr>
-              <w:t>53</w:t>
+              <w:t>26</w:t>
             </w:r>
           </w:p>
         </w:tc>
@@ -6839,7 +6685,7 @@
               <w:rPr>
                 <w:sz w:val="20"/>
               </w:rPr>
-              <w:t>57</w:t>
+              <w:t>28</w:t>
             </w:r>
           </w:p>
         </w:tc>
@@ -6916,7 +6762,7 @@
               <w:rPr>
                 <w:sz w:val="20"/>
               </w:rPr>
-              <w:t>59</w:t>
+              <w:t>29</w:t>
             </w:r>
           </w:p>
         </w:tc>
@@ -6993,7 +6839,7 @@
               <w:rPr>
                 <w:sz w:val="20"/>
               </w:rPr>
-              <w:t>61</w:t>
+              <w:t>30</w:t>
             </w:r>
           </w:p>
         </w:tc>
@@ -7070,7 +6916,7 @@
               <w:rPr>
                 <w:sz w:val="20"/>
               </w:rPr>
-              <w:t>68</w:t>
+              <w:t>33</w:t>
             </w:r>
           </w:p>
         </w:tc>
@@ -8819,9 +8665,15 @@
       </w:pPr>
     </w:p>
     <w:p>
-      <w:r>
-        <w:br w:type="page"/>
-      </w:r>
+      <w:pPr>
+        <w:sectPr>
+          <w:footerReference w:type="default" r:id="rId18"/>
+          <w:pgSz w:w="11909" w:h="16834"/>
+          <w:pgMar w:top="1440" w:right="1440" w:bottom="1440" w:left="2160" w:header="720" w:footer="720" w:gutter="0"/>
+          <w:cols w:space="720"/>
+          <w:docGrid w:linePitch="360"/>
+        </w:sectPr>
+      </w:pPr>
     </w:p>
     <w:p>
       <w:pPr>
@@ -24296,13 +24148,45 @@
       </w:r>
     </w:p>
     <w:sectPr>
+      <w:footerReference w:type="default" r:id="rId19"/>
       <w:pgSz w:w="11909" w:h="16834"/>
       <w:pgMar w:top="1440" w:right="1440" w:bottom="1440" w:left="2160" w:header="720" w:footer="720" w:gutter="0"/>
       <w:cols w:space="720"/>
       <w:docGrid w:linePitch="360"/>
+      <w:pgNumType w:start="1"/>
     </w:sectPr>
   </w:body>
 </w:document>
+</file>
+
+<file path=word/footer1.xml><?xml version="1.0" encoding="utf-8"?>
+<w:ftr xmlns:m="http://schemas.openxmlformats.org/officeDocument/2006/math" xmlns:mc="http://schemas.openxmlformats.org/markup-compatibility/2006" xmlns:mo="http://schemas.microsoft.com/office/mac/office/2008/main" xmlns:mv="urn:schemas-microsoft-com:mac:vml" xmlns:o="urn:schemas-microsoft-com:office:office" xmlns:r="http://schemas.openxmlformats.org/officeDocument/2006/relationships" xmlns:v="urn:schemas-microsoft-com:vml" xmlns:w10="urn:schemas-microsoft-com:office:word" xmlns:w14="http://schemas.microsoft.com/office/word/2010/wordml" xmlns:w="http://schemas.openxmlformats.org/wordprocessingml/2006/main" xmlns:wne="http://schemas.microsoft.com/office/word/2006/wordml" xmlns:wp14="http://schemas.microsoft.com/office/word/2010/wordprocessingDrawing" xmlns:wp="http://schemas.openxmlformats.org/drawingml/2006/wordprocessingDrawing" xmlns:wpc="http://schemas.microsoft.com/office/word/2010/wordprocessingCanvas" xmlns:wpg="http://schemas.microsoft.com/office/word/2010/wordprocessingGroup" xmlns:wpi="http://schemas.microsoft.com/office/word/2010/wordprocessingInk" xmlns:wps="http://schemas.microsoft.com/office/word/2010/wordprocessingShape" mc:Ignorable="w14 wp14">
+  <w:p>
+    <w:pPr>
+      <w:pStyle w:val="Footer"/>
+    </w:pPr>
+    <w:r/>
+  </w:p>
+</w:ftr>
+</file>
+
+<file path=word/footer2.xml><?xml version="1.0" encoding="utf-8"?>
+<w:ftr xmlns:m="http://schemas.openxmlformats.org/officeDocument/2006/math" xmlns:mc="http://schemas.openxmlformats.org/markup-compatibility/2006" xmlns:mo="http://schemas.microsoft.com/office/mac/office/2008/main" xmlns:mv="urn:schemas-microsoft-com:mac:vml" xmlns:o="urn:schemas-microsoft-com:office:office" xmlns:r="http://schemas.openxmlformats.org/officeDocument/2006/relationships" xmlns:v="urn:schemas-microsoft-com:vml" xmlns:w10="urn:schemas-microsoft-com:office:word" xmlns:w14="http://schemas.microsoft.com/office/word/2010/wordml" xmlns:w="http://schemas.openxmlformats.org/wordprocessingml/2006/main" xmlns:wne="http://schemas.microsoft.com/office/word/2006/wordml" xmlns:wp14="http://schemas.microsoft.com/office/word/2010/wordprocessingDrawing" xmlns:wp="http://schemas.openxmlformats.org/drawingml/2006/wordprocessingDrawing" xmlns:wpc="http://schemas.microsoft.com/office/word/2010/wordprocessingCanvas" xmlns:wpg="http://schemas.microsoft.com/office/word/2010/wordprocessingGroup" xmlns:wpi="http://schemas.microsoft.com/office/word/2010/wordprocessingInk" xmlns:wps="http://schemas.microsoft.com/office/word/2010/wordprocessingShape" mc:Ignorable="w14 wp14">
+  <w:p>
+    <w:pPr>
+      <w:pStyle w:val="Footer"/>
+      <w:jc w:val="center"/>
+    </w:pPr>
+    <w:r/>
+    <w:r>
+      <w:rPr>
+        <w:rFonts w:ascii="Times New Roman" w:hAnsi="Times New Roman"/>
+        <w:sz w:val="22"/>
+      </w:rPr>
+    </w:r>
+    <w:fldSimple w:instr="PAGE"/>
+  </w:p>
+</w:ftr>
 </file>
 
 <file path=word/numbering.xml><?xml version="1.0" encoding="utf-8"?>

</xml_diff>

<commit_message>
Format report first three pages with official Sreenidhi University pattern preserving existing student and faculty details
</commit_message>
<xml_diff>
--- a/report/AI_Generated_Image_Detection_Project_Report.docx
+++ b/report/AI_Generated_Image_Detection_Project_Report.docx
@@ -4,411 +4,1136 @@
   <w:body>
     <w:p>
       <w:pPr>
+        <w:spacing w:before="0" w:after="280"/>
         <w:jc w:val="center"/>
       </w:pPr>
       <w:r>
+        <w:drawing>
+          <wp:inline xmlns:a="http://schemas.openxmlformats.org/drawingml/2006/main" xmlns:pic="http://schemas.openxmlformats.org/drawingml/2006/picture">
+            <wp:extent cx="2560320" cy="541324"/>
+            <wp:docPr id="12" name="Picture 12"/>
+            <wp:cNvGraphicFramePr>
+              <a:graphicFrameLocks noChangeAspect="1"/>
+            </wp:cNvGraphicFramePr>
+            <a:graphic>
+              <a:graphicData uri="http://schemas.openxmlformats.org/drawingml/2006/picture">
+                <pic:pic>
+                  <pic:nvPicPr>
+                    <pic:cNvPr id="0" name="sreenidhi_logo.png"/>
+                    <pic:cNvPicPr/>
+                  </pic:nvPicPr>
+                  <pic:blipFill>
+                    <a:blip r:embed="rId20"/>
+                    <a:stretch>
+                      <a:fillRect/>
+                    </a:stretch>
+                  </pic:blipFill>
+                  <pic:spPr>
+                    <a:xfrm>
+                      <a:off x="0" y="0"/>
+                      <a:ext cx="2560320" cy="541324"/>
+                    </a:xfrm>
+                    <a:prstGeom prst="rect"/>
+                  </pic:spPr>
+                </pic:pic>
+              </a:graphicData>
+            </a:graphic>
+          </wp:inline>
+        </w:drawing>
+      </w:r>
+    </w:p>
+    <w:p>
+      <w:pPr>
+        <w:spacing w:before="0" w:after="80"/>
+        <w:jc w:val="center"/>
+      </w:pPr>
+      <w:r>
         <w:rPr>
+          <w:rFonts w:ascii="Times New Roman" w:hAnsi="Times New Roman"/>
           <w:b/>
-          <w:color w:val="002855"/>
-          <w:sz w:val="36"/>
+          <w:sz w:val="30"/>
         </w:rPr>
-        <w:t>SREENIDHI UNIVERSITY</w:t>
-      </w:r>
+        <w:t>Technical Writing Report</w:t>
+      </w:r>
+    </w:p>
+    <w:p>
+      <w:pPr>
+        <w:spacing w:before="0" w:after="160"/>
+        <w:jc w:val="center"/>
+      </w:pPr>
       <w:r>
         <w:rPr>
+          <w:rFonts w:ascii="Times New Roman" w:hAnsi="Times New Roman"/>
           <w:b/>
-          <w:color w:val="002855"/>
-          <w:sz w:val="36"/>
+          <w:sz w:val="24"/>
         </w:rPr>
-        <w:br/>
-      </w:r>
+        <w:t>On</w:t>
+      </w:r>
+    </w:p>
+    <w:p>
+      <w:pPr>
+        <w:spacing w:before="0" w:after="280" w:line="276" w:lineRule="auto"/>
+        <w:jc w:val="center"/>
+      </w:pPr>
       <w:r>
         <w:rPr>
+          <w:rFonts w:ascii="Times New Roman" w:hAnsi="Times New Roman"/>
           <w:b/>
-          <w:color w:val="333333"/>
+          <w:color w:val="C42124"/>
           <w:sz w:val="28"/>
         </w:rPr>
-        <w:t>DEPARTMENT OF COMPUTER SCIENCE AND ENGINEERING</w:t>
-      </w:r>
-      <w:r>
-        <w:rPr>
-          <w:b/>
-          <w:color w:val="333333"/>
-          <w:sz w:val="28"/>
-        </w:rPr>
+        <w:t>“AI-GENERATED IMAGE DETECTION</w:t>
         <w:br/>
-      </w:r>
-      <w:r>
-        <w:rPr>
-          <w:b/>
-          <w:color w:val="333333"/>
-          <w:sz w:val="28"/>
-        </w:rPr>
-        <w:br/>
+        <w:t>USING DEEP LEARNING.”</w:t>
       </w:r>
     </w:p>
     <w:p>
       <w:pPr>
-        <w:spacing w:before="600" w:after="320" w:line="288" w:lineRule="auto"/>
+        <w:spacing w:before="0" w:after="80"/>
         <w:jc w:val="center"/>
       </w:pPr>
       <w:r>
         <w:rPr>
+          <w:rFonts w:ascii="Times New Roman" w:hAnsi="Times New Roman"/>
           <w:b/>
-          <w:color w:val="002855"/>
-          <w:sz w:val="40"/>
+          <w:color w:val="285782"/>
+          <w:sz w:val="23"/>
         </w:rPr>
-        <w:t>AI-GENERATED IMAGE DETECTION USING DEEP LEARNING</w:t>
+        <w:t>DEPARTMENT OF COMPUTER SCIENCE AND ENGINEERING (CSE)</w:t>
       </w:r>
     </w:p>
     <w:p>
       <w:pPr>
-        <w:spacing w:line="312" w:lineRule="auto"/>
+        <w:spacing w:before="0" w:after="280"/>
         <w:jc w:val="center"/>
       </w:pPr>
+      <w:r>
+        <w:rPr>
+          <w:rFonts w:ascii="Times New Roman" w:hAnsi="Times New Roman"/>
+          <w:b/>
+          <w:color w:val="285782"/>
+          <w:sz w:val="22"/>
+        </w:rPr>
+        <w:t>III- Year- I-Semester</w:t>
+      </w:r>
+    </w:p>
+    <w:p>
+      <w:pPr>
+        <w:spacing w:before="0" w:after="120"/>
+        <w:jc w:val="center"/>
+      </w:pPr>
+      <w:r>
+        <w:rPr>
+          <w:rFonts w:ascii="Times New Roman" w:hAnsi="Times New Roman"/>
+          <w:b/>
+          <w:sz w:val="22"/>
+        </w:rPr>
+        <w:t>SUBMITTED BY</w:t>
+      </w:r>
+    </w:p>
+    <w:tbl>
+      <w:tblPr>
+        <w:tblW w:type="auto" w:w="0"/>
+        <w:jc w:val="center"/>
+        <w:tblLook w:firstColumn="1" w:firstRow="1" w:lastColumn="0" w:lastRow="0" w:noHBand="0" w:noVBand="1" w:val="04A0"/>
+        <w:tblBorders>
+          <w:top w:val="single" w:sz="4" w:space="0" w:color="000000"/>
+          <w:left w:val="single" w:sz="4" w:space="0" w:color="000000"/>
+          <w:bottom w:val="single" w:sz="4" w:space="0" w:color="000000"/>
+          <w:right w:val="single" w:sz="4" w:space="0" w:color="000000"/>
+          <w:insideH w:val="single" w:sz="4" w:space="0" w:color="000000"/>
+          <w:insideV w:val="single" w:sz="4" w:space="0" w:color="000000"/>
+        </w:tblBorders>
+      </w:tblPr>
+      <w:tblGrid>
+        <w:gridCol w:w="4154"/>
+        <w:gridCol w:w="4154"/>
+      </w:tblGrid>
+      <w:tr>
+        <w:tc>
+          <w:tcPr>
+            <w:tcW w:type="dxa" w:w="8308"/>
+            <w:gridSpan w:val="2"/>
+            <w:tcMar>
+              <w:top w:w="70" w:type="dxa"/>
+              <w:bottom w:w="70" w:type="dxa"/>
+              <w:left w:w="100" w:type="dxa"/>
+              <w:right w:w="100" w:type="dxa"/>
+            </w:tcMar>
+          </w:tcPr>
+          <w:p>
+            <w:pPr>
+              <w:jc w:val="center"/>
+            </w:pPr>
+            <w:r>
+              <w:rPr>
+                <w:rFonts w:ascii="Times New Roman" w:hAnsi="Times New Roman"/>
+                <w:b/>
+                <w:sz w:val="21"/>
+              </w:rPr>
+              <w:t>Batch No. B31</w:t>
+            </w:r>
+          </w:p>
+        </w:tc>
+      </w:tr>
+      <w:tr>
+        <w:tc>
+          <w:tcPr>
+            <w:tcW w:type="dxa" w:w="4608"/>
+            <w:tcMar>
+              <w:top w:w="60" w:type="dxa"/>
+              <w:bottom w:w="60" w:type="dxa"/>
+              <w:left w:w="120" w:type="dxa"/>
+              <w:right w:w="100" w:type="dxa"/>
+            </w:tcMar>
+          </w:tcPr>
+          <w:p>
+            <w:pPr>
+              <w:jc w:val="left"/>
+            </w:pPr>
+            <w:r>
+              <w:rPr>
+                <w:rFonts w:ascii="Times New Roman" w:hAnsi="Times New Roman"/>
+                <w:sz w:val="20"/>
+              </w:rPr>
+              <w:t>Bojja Sahasra</w:t>
+            </w:r>
+          </w:p>
+        </w:tc>
+        <w:tc>
+          <w:tcPr>
+            <w:tcW w:type="dxa" w:w="3312"/>
+            <w:tcMar>
+              <w:top w:w="60" w:type="dxa"/>
+              <w:bottom w:w="60" w:type="dxa"/>
+              <w:left w:w="100" w:type="dxa"/>
+              <w:right w:w="100" w:type="dxa"/>
+            </w:tcMar>
+          </w:tcPr>
+          <w:p>
+            <w:pPr>
+              <w:jc w:val="center"/>
+            </w:pPr>
+            <w:r>
+              <w:rPr>
+                <w:rFonts w:ascii="Times New Roman" w:hAnsi="Times New Roman"/>
+                <w:b/>
+                <w:sz w:val="20"/>
+              </w:rPr>
+              <w:t>2401100CSE0243</w:t>
+            </w:r>
+          </w:p>
+        </w:tc>
+      </w:tr>
+      <w:tr>
+        <w:tc>
+          <w:tcPr>
+            <w:tcW w:type="dxa" w:w="4608"/>
+            <w:tcMar>
+              <w:top w:w="60" w:type="dxa"/>
+              <w:bottom w:w="60" w:type="dxa"/>
+              <w:left w:w="120" w:type="dxa"/>
+              <w:right w:w="100" w:type="dxa"/>
+            </w:tcMar>
+          </w:tcPr>
+          <w:p>
+            <w:pPr>
+              <w:jc w:val="left"/>
+            </w:pPr>
+            <w:r>
+              <w:rPr>
+                <w:rFonts w:ascii="Times New Roman" w:hAnsi="Times New Roman"/>
+                <w:sz w:val="20"/>
+              </w:rPr>
+              <w:t>Mudigonda Lalitha Sreya</w:t>
+            </w:r>
+          </w:p>
+        </w:tc>
+        <w:tc>
+          <w:tcPr>
+            <w:tcW w:type="dxa" w:w="3312"/>
+            <w:tcMar>
+              <w:top w:w="60" w:type="dxa"/>
+              <w:bottom w:w="60" w:type="dxa"/>
+              <w:left w:w="100" w:type="dxa"/>
+              <w:right w:w="100" w:type="dxa"/>
+            </w:tcMar>
+          </w:tcPr>
+          <w:p>
+            <w:pPr>
+              <w:jc w:val="center"/>
+            </w:pPr>
+            <w:r>
+              <w:rPr>
+                <w:rFonts w:ascii="Times New Roman" w:hAnsi="Times New Roman"/>
+                <w:b/>
+                <w:sz w:val="20"/>
+              </w:rPr>
+              <w:t>2401100CSE0264</w:t>
+            </w:r>
+          </w:p>
+        </w:tc>
+      </w:tr>
+      <w:tr>
+        <w:tc>
+          <w:tcPr>
+            <w:tcW w:type="dxa" w:w="4608"/>
+            <w:tcMar>
+              <w:top w:w="60" w:type="dxa"/>
+              <w:bottom w:w="60" w:type="dxa"/>
+              <w:left w:w="120" w:type="dxa"/>
+              <w:right w:w="100" w:type="dxa"/>
+            </w:tcMar>
+          </w:tcPr>
+          <w:p>
+            <w:pPr>
+              <w:jc w:val="left"/>
+            </w:pPr>
+            <w:r>
+              <w:rPr>
+                <w:rFonts w:ascii="Times New Roman" w:hAnsi="Times New Roman"/>
+                <w:sz w:val="20"/>
+              </w:rPr>
+              <w:t>Rohan Joshua Francis</w:t>
+            </w:r>
+          </w:p>
+        </w:tc>
+        <w:tc>
+          <w:tcPr>
+            <w:tcW w:type="dxa" w:w="3312"/>
+            <w:tcMar>
+              <w:top w:w="60" w:type="dxa"/>
+              <w:bottom w:w="60" w:type="dxa"/>
+              <w:left w:w="100" w:type="dxa"/>
+              <w:right w:w="100" w:type="dxa"/>
+            </w:tcMar>
+          </w:tcPr>
+          <w:p>
+            <w:pPr>
+              <w:jc w:val="center"/>
+            </w:pPr>
+            <w:r>
+              <w:rPr>
+                <w:rFonts w:ascii="Times New Roman" w:hAnsi="Times New Roman"/>
+                <w:b/>
+                <w:sz w:val="20"/>
+              </w:rPr>
+              <w:t>2401100CSE0275</w:t>
+            </w:r>
+          </w:p>
+        </w:tc>
+      </w:tr>
+    </w:tbl>
+    <w:p>
+      <w:pPr>
+        <w:spacing w:before="320" w:after="80"/>
+        <w:jc w:val="center"/>
+      </w:pPr>
+      <w:r>
+        <w:rPr>
+          <w:rFonts w:ascii="Times New Roman" w:hAnsi="Times New Roman"/>
+          <w:b/>
+          <w:sz w:val="21"/>
+        </w:rPr>
+        <w:t>UNDER THE GUIDANCE OF</w:t>
+      </w:r>
+    </w:p>
+    <w:p>
+      <w:pPr>
+        <w:spacing w:before="0" w:after="40"/>
+        <w:jc w:val="center"/>
+      </w:pPr>
+      <w:r>
+        <w:rPr>
+          <w:rFonts w:ascii="Times New Roman" w:hAnsi="Times New Roman"/>
+          <w:b/>
+          <w:sz w:val="23"/>
+        </w:rPr>
+        <w:t>Dr. Saritha Bantu</w:t>
+      </w:r>
+    </w:p>
+    <w:p>
+      <w:pPr>
+        <w:spacing w:before="0" w:after="40"/>
+        <w:jc w:val="center"/>
+      </w:pPr>
+      <w:r>
+        <w:rPr>
+          <w:rFonts w:ascii="Times New Roman" w:hAnsi="Times New Roman"/>
+          <w:sz w:val="21"/>
+        </w:rPr>
+        <w:t>Professor,</w:t>
+      </w:r>
+    </w:p>
+    <w:p>
+      <w:pPr>
+        <w:spacing w:before="0" w:after="40"/>
+        <w:jc w:val="center"/>
+      </w:pPr>
+      <w:r>
+        <w:rPr>
+          <w:rFonts w:ascii="Times New Roman" w:hAnsi="Times New Roman"/>
+          <w:sz w:val="21"/>
+        </w:rPr>
+        <w:t>CSE department</w:t>
+      </w:r>
+    </w:p>
+    <w:p>
+      <w:pPr>
+        <w:spacing w:before="0" w:after="40"/>
+        <w:jc w:val="center"/>
+      </w:pPr>
+      <w:r>
+        <w:rPr>
+          <w:rFonts w:ascii="Times New Roman" w:hAnsi="Times New Roman"/>
+          <w:sz w:val="21"/>
+        </w:rPr>
+        <w:t>Sreenidhi University-Hyderabad</w:t>
+      </w:r>
+    </w:p>
+    <w:p>
+      <w:pPr>
+        <w:spacing w:before="0" w:after="40"/>
+        <w:jc w:val="center"/>
+      </w:pPr>
+      <w:r>
+        <w:rPr>
+          <w:rFonts w:ascii="Times New Roman" w:hAnsi="Times New Roman"/>
+          <w:sz w:val="21"/>
+        </w:rPr>
+        <w:t>2026-2027</w:t>
+      </w:r>
+    </w:p>
+    <w:p>
+      <w:r>
+        <w:br w:type="page"/>
+      </w:r>
+    </w:p>
+    <w:p>
+      <w:pPr>
+        <w:spacing w:before="160" w:after="320"/>
+        <w:jc w:val="center"/>
+      </w:pPr>
+      <w:r>
+        <w:rPr>
+          <w:rFonts w:ascii="Times New Roman" w:hAnsi="Times New Roman"/>
+          <w:b/>
+          <w:color w:val="285782"/>
+          <w:sz w:val="30"/>
+        </w:rPr>
+        <w:t>Acknowledgment</w:t>
+      </w:r>
+    </w:p>
+    <w:p>
+      <w:pPr>
+        <w:spacing w:line="312" w:lineRule="auto" w:after="200"/>
+        <w:jc w:val="both"/>
+      </w:pPr>
+      <w:r>
+        <w:t xml:space="preserve">We are grateful for the opportunity to undertake this </w:t>
+      </w:r>
       <w:r>
         <w:rPr>
           <w:i/>
         </w:rPr>
-        <w:t>A Mini-Project Report Submitted in Partial Fulfillment</w:t>
+        <w:t>Technical Writing</w:t>
+      </w:r>
+      <w:r>
+        <w:t xml:space="preserve"> titled </w:t>
       </w:r>
       <w:r>
         <w:rPr>
+          <w:b/>
           <w:i/>
         </w:rPr>
-        <w:br/>
-        <w:t>of the Requirements for the Award of the Degree of</w:t>
-      </w:r>
-      <w:r>
-        <w:rPr>
-          <w:i/>
-        </w:rPr>
-        <w:br/>
-      </w:r>
-      <w:r>
-        <w:rPr>
-          <w:i/>
-        </w:rPr>
-        <w:br/>
-      </w:r>
-      <w:r>
-        <w:rPr>
-          <w:b/>
-          <w:sz w:val="26"/>
-        </w:rPr>
-        <w:t>BACHELOR OF TECHNOLOGY</w:t>
-      </w:r>
-      <w:r>
-        <w:rPr>
-          <w:b/>
-          <w:sz w:val="26"/>
-        </w:rPr>
-        <w:br/>
-        <w:t>IN</w:t>
-      </w:r>
-      <w:r>
-        <w:rPr>
-          <w:b/>
-          <w:sz w:val="26"/>
-        </w:rPr>
-        <w:br/>
-        <w:t>COMPUTER SCIENCE AND ENGINEERING</w:t>
-      </w:r>
-      <w:r>
-        <w:rPr>
-          <w:b/>
-          <w:sz w:val="26"/>
-        </w:rPr>
-        <w:br/>
-      </w:r>
-      <w:r>
-        <w:rPr>
-          <w:b/>
-          <w:sz w:val="26"/>
-        </w:rPr>
-        <w:br/>
-      </w:r>
-    </w:p>
-    <w:p>
-      <w:pPr>
-        <w:spacing w:line="312" w:lineRule="auto"/>
-        <w:jc w:val="center"/>
-      </w:pPr>
+        <w:t>“AI-Generated Image Detection Using Deep Learning”</w:t>
+      </w:r>
+      <w:r>
+        <w:t xml:space="preserve"> as part of our academic curriculum in the Third Year, First Semester of the academic year </w:t>
+      </w:r>
       <w:r>
         <w:rPr>
           <w:b/>
         </w:rPr>
-        <w:t>Submitted by:</w:t>
+        <w:t>2026-2027</w:t>
+      </w:r>
+      <w:r>
+        <w:t xml:space="preserve"> at </w:t>
       </w:r>
       <w:r>
         <w:rPr>
           <w:b/>
         </w:rPr>
-        <w:br/>
-      </w:r>
-      <w:r>
-        <w:t>Bojja Sahasra (Roll No: 2401100CSE0243)</w:t>
-      </w:r>
-      <w:r>
-        <w:br/>
-        <w:t>Rohan Joshua Francis (Roll No: 2401100CSE0275)</w:t>
-      </w:r>
-      <w:r>
-        <w:br/>
-        <w:t>Mudigonda Lalitha Sreya (Roll No: 2401100CSE0264)</w:t>
-      </w:r>
-      <w:r>
-        <w:br/>
-      </w:r>
-      <w:r>
-        <w:br/>
+        <w:t>Sreenidhi University.</w:t>
       </w:r>
     </w:p>
     <w:p>
       <w:pPr>
-        <w:spacing w:line="312" w:lineRule="auto"/>
-        <w:jc w:val="center"/>
-      </w:pPr>
+        <w:spacing w:line="312" w:lineRule="auto" w:after="200"/>
+        <w:jc w:val="both"/>
+      </w:pPr>
+      <w:r>
+        <w:t xml:space="preserve">We extend our heartfelt gratitude to </w:t>
+      </w:r>
       <w:r>
         <w:rPr>
           <w:b/>
         </w:rPr>
-        <w:t>Under the Guidance of:</w:t>
+        <w:t>Dean Dr. M. Karthikeyan</w:t>
+      </w:r>
+      <w:r>
+        <w:t xml:space="preserve"> and </w:t>
       </w:r>
       <w:r>
         <w:rPr>
           <w:b/>
         </w:rPr>
-        <w:br/>
-      </w:r>
-      <w:r>
-        <w:t>Dr. Saritha Bantu</w:t>
-      </w:r>
-      <w:r>
-        <w:br/>
-      </w:r>
-      <w:r>
-        <w:t>Professor, Department of Computer Science and Engineering</w:t>
-      </w:r>
-      <w:r>
-        <w:br/>
-        <w:t>Sreenidhi University</w:t>
-      </w:r>
-      <w:r>
-        <w:br/>
-      </w:r>
-      <w:r>
-        <w:br/>
+        <w:t>Dr. Padmaja Grandhe</w:t>
+      </w:r>
+      <w:r>
+        <w:t xml:space="preserve"> for his invaluable guidance and encouragement throughout this technical writing course.</w:t>
       </w:r>
     </w:p>
     <w:p>
       <w:pPr>
-        <w:jc w:val="center"/>
-      </w:pPr>
-      <w:r>
-        <w:t>Academic Year: 2026–2027</w:t>
-        <w:br/>
-        <w:t>Submission Date: October 2026</w:t>
+        <w:spacing w:line="312" w:lineRule="auto" w:after="200"/>
+        <w:jc w:val="both"/>
+      </w:pPr>
+      <w:r>
+        <w:t xml:space="preserve">We sincerely thank </w:t>
+      </w:r>
+      <w:r>
+        <w:rPr>
+          <w:b/>
+        </w:rPr>
+        <w:t>Dr. Saritha Bantu</w:t>
+      </w:r>
+      <w:r>
+        <w:t>, our guide and Professor for CSE Department, for her unwavering support, encouragement, and guidance during the course of this technical writing. Her insights and expertise were instrumental in shaping this work.</w:t>
       </w:r>
     </w:p>
     <w:p>
-      <w:r>
-        <w:br w:type="page"/>
+      <w:pPr>
+        <w:spacing w:line="312" w:lineRule="auto" w:after="400"/>
+        <w:jc w:val="both"/>
+      </w:pPr>
+      <w:r>
+        <w:t xml:space="preserve">We also extend our heartfelt gratitude to the </w:t>
+      </w:r>
+      <w:r>
+        <w:rPr>
+          <w:b/>
+        </w:rPr>
+        <w:t>Department of Computer Science and Engineering</w:t>
+      </w:r>
+      <w:r>
+        <w:t xml:space="preserve"> for providing the necessary resources and fostering an encouraging learning environment.</w:t>
       </w:r>
     </w:p>
     <w:p>
       <w:pPr>
-        <w:spacing w:before="360" w:line="312" w:lineRule="auto"/>
-        <w:jc w:val="left"/>
-      </w:pPr>
+        <w:spacing w:before="160" w:after="160"/>
+        <w:jc w:val="center"/>
+      </w:pPr>
+      <w:r>
+        <w:rPr>
+          <w:rFonts w:ascii="Times New Roman" w:hAnsi="Times New Roman"/>
+          <w:b/>
+          <w:sz w:val="22"/>
+        </w:rPr>
+        <w:t>CONTRIBUTORS:</w:t>
+      </w:r>
+    </w:p>
+    <w:tbl>
+      <w:tblPr>
+        <w:tblW w:type="auto" w:w="0"/>
+        <w:jc w:val="center"/>
+        <w:tblLook w:firstColumn="1" w:firstRow="1" w:lastColumn="0" w:lastRow="0" w:noHBand="0" w:noVBand="1" w:val="04A0"/>
+        <w:tblBorders>
+          <w:top w:val="single" w:sz="4" w:space="0" w:color="000000"/>
+          <w:left w:val="single" w:sz="4" w:space="0" w:color="000000"/>
+          <w:bottom w:val="single" w:sz="4" w:space="0" w:color="000000"/>
+          <w:right w:val="single" w:sz="4" w:space="0" w:color="000000"/>
+          <w:insideH w:val="single" w:sz="4" w:space="0" w:color="000000"/>
+          <w:insideV w:val="single" w:sz="4" w:space="0" w:color="000000"/>
+        </w:tblBorders>
+      </w:tblPr>
+      <w:tblGrid>
+        <w:gridCol w:w="2770"/>
+        <w:gridCol w:w="2770"/>
+        <w:gridCol w:w="2770"/>
+      </w:tblGrid>
+      <w:tr>
+        <w:tc>
+          <w:tcPr>
+            <w:tcW w:type="dxa" w:w="2880"/>
+            <w:tcMar>
+              <w:top w:w="70" w:type="dxa"/>
+              <w:bottom w:w="70" w:type="dxa"/>
+              <w:left w:w="100" w:type="dxa"/>
+              <w:right w:w="100" w:type="dxa"/>
+            </w:tcMar>
+          </w:tcPr>
+          <w:p>
+            <w:pPr>
+              <w:jc w:val="center"/>
+            </w:pPr>
+            <w:r>
+              <w:rPr>
+                <w:rFonts w:ascii="Times New Roman" w:hAnsi="Times New Roman"/>
+                <w:b/>
+                <w:sz w:val="20"/>
+              </w:rPr>
+              <w:t>2401100CSE0243</w:t>
+            </w:r>
+          </w:p>
+        </w:tc>
+        <w:tc>
+          <w:tcPr>
+            <w:tcW w:type="dxa" w:w="3600"/>
+            <w:tcMar>
+              <w:top w:w="70" w:type="dxa"/>
+              <w:bottom w:w="70" w:type="dxa"/>
+              <w:left w:w="120" w:type="dxa"/>
+              <w:right w:w="100" w:type="dxa"/>
+            </w:tcMar>
+          </w:tcPr>
+          <w:p>
+            <w:pPr>
+              <w:jc w:val="left"/>
+            </w:pPr>
+            <w:r>
+              <w:rPr>
+                <w:rFonts w:ascii="Times New Roman" w:hAnsi="Times New Roman"/>
+                <w:b/>
+                <w:sz w:val="20"/>
+              </w:rPr>
+              <w:t>Bojja Sahasra</w:t>
+            </w:r>
+          </w:p>
+        </w:tc>
+        <w:tc>
+          <w:tcPr>
+            <w:tcW w:type="dxa" w:w="2160"/>
+            <w:tcMar>
+              <w:top w:w="70" w:type="dxa"/>
+              <w:bottom w:w="70" w:type="dxa"/>
+              <w:left w:w="100" w:type="dxa"/>
+              <w:right w:w="100" w:type="dxa"/>
+            </w:tcMar>
+          </w:tcPr>
+          <w:p>
+            <w:pPr>
+              <w:jc w:val="center"/>
+            </w:pPr>
+            <w:r>
+              <w:rPr>
+                <w:rFonts w:ascii="Times New Roman" w:hAnsi="Times New Roman"/>
+                <w:sz w:val="20"/>
+              </w:rPr>
+              <w:t>Sahasra</w:t>
+            </w:r>
+          </w:p>
+        </w:tc>
+      </w:tr>
+      <w:tr>
+        <w:tc>
+          <w:tcPr>
+            <w:tcW w:type="dxa" w:w="2880"/>
+            <w:tcMar>
+              <w:top w:w="70" w:type="dxa"/>
+              <w:bottom w:w="70" w:type="dxa"/>
+              <w:left w:w="100" w:type="dxa"/>
+              <w:right w:w="100" w:type="dxa"/>
+            </w:tcMar>
+          </w:tcPr>
+          <w:p>
+            <w:pPr>
+              <w:jc w:val="center"/>
+            </w:pPr>
+            <w:r>
+              <w:rPr>
+                <w:rFonts w:ascii="Times New Roman" w:hAnsi="Times New Roman"/>
+                <w:b/>
+                <w:sz w:val="20"/>
+              </w:rPr>
+              <w:t>2401100CSE0264</w:t>
+            </w:r>
+          </w:p>
+        </w:tc>
+        <w:tc>
+          <w:tcPr>
+            <w:tcW w:type="dxa" w:w="3600"/>
+            <w:tcMar>
+              <w:top w:w="70" w:type="dxa"/>
+              <w:bottom w:w="70" w:type="dxa"/>
+              <w:left w:w="120" w:type="dxa"/>
+              <w:right w:w="100" w:type="dxa"/>
+            </w:tcMar>
+          </w:tcPr>
+          <w:p>
+            <w:pPr>
+              <w:jc w:val="left"/>
+            </w:pPr>
+            <w:r>
+              <w:rPr>
+                <w:rFonts w:ascii="Times New Roman" w:hAnsi="Times New Roman"/>
+                <w:b/>
+                <w:sz w:val="20"/>
+              </w:rPr>
+              <w:t>Mudigonda Lalitha Sreya</w:t>
+            </w:r>
+          </w:p>
+        </w:tc>
+        <w:tc>
+          <w:tcPr>
+            <w:tcW w:type="dxa" w:w="2160"/>
+            <w:tcMar>
+              <w:top w:w="70" w:type="dxa"/>
+              <w:bottom w:w="70" w:type="dxa"/>
+              <w:left w:w="100" w:type="dxa"/>
+              <w:right w:w="100" w:type="dxa"/>
+            </w:tcMar>
+          </w:tcPr>
+          <w:p>
+            <w:pPr>
+              <w:jc w:val="center"/>
+            </w:pPr>
+            <w:r>
+              <w:rPr>
+                <w:rFonts w:ascii="Times New Roman" w:hAnsi="Times New Roman"/>
+                <w:sz w:val="20"/>
+              </w:rPr>
+              <w:t>Lalitha</w:t>
+            </w:r>
+          </w:p>
+        </w:tc>
+      </w:tr>
+      <w:tr>
+        <w:tc>
+          <w:tcPr>
+            <w:tcW w:type="dxa" w:w="2880"/>
+            <w:tcMar>
+              <w:top w:w="70" w:type="dxa"/>
+              <w:bottom w:w="70" w:type="dxa"/>
+              <w:left w:w="100" w:type="dxa"/>
+              <w:right w:w="100" w:type="dxa"/>
+            </w:tcMar>
+          </w:tcPr>
+          <w:p>
+            <w:pPr>
+              <w:jc w:val="center"/>
+            </w:pPr>
+            <w:r>
+              <w:rPr>
+                <w:rFonts w:ascii="Times New Roman" w:hAnsi="Times New Roman"/>
+                <w:b/>
+                <w:sz w:val="20"/>
+              </w:rPr>
+              <w:t>2401100CSE0275</w:t>
+            </w:r>
+          </w:p>
+        </w:tc>
+        <w:tc>
+          <w:tcPr>
+            <w:tcW w:type="dxa" w:w="3600"/>
+            <w:tcMar>
+              <w:top w:w="70" w:type="dxa"/>
+              <w:bottom w:w="70" w:type="dxa"/>
+              <w:left w:w="120" w:type="dxa"/>
+              <w:right w:w="100" w:type="dxa"/>
+            </w:tcMar>
+          </w:tcPr>
+          <w:p>
+            <w:pPr>
+              <w:jc w:val="left"/>
+            </w:pPr>
+            <w:r>
+              <w:rPr>
+                <w:rFonts w:ascii="Times New Roman" w:hAnsi="Times New Roman"/>
+                <w:b/>
+                <w:sz w:val="20"/>
+              </w:rPr>
+              <w:t>Rohan Joshua Francis</w:t>
+            </w:r>
+          </w:p>
+        </w:tc>
+        <w:tc>
+          <w:tcPr>
+            <w:tcW w:type="dxa" w:w="2160"/>
+            <w:tcMar>
+              <w:top w:w="70" w:type="dxa"/>
+              <w:bottom w:w="70" w:type="dxa"/>
+              <w:left w:w="100" w:type="dxa"/>
+              <w:right w:w="100" w:type="dxa"/>
+            </w:tcMar>
+          </w:tcPr>
+          <w:p>
+            <w:pPr>
+              <w:jc w:val="center"/>
+            </w:pPr>
+            <w:r>
+              <w:rPr>
+                <w:rFonts w:ascii="Times New Roman" w:hAnsi="Times New Roman"/>
+                <w:sz w:val="20"/>
+              </w:rPr>
+              <w:t>Rohan</w:t>
+            </w:r>
+          </w:p>
+        </w:tc>
+      </w:tr>
+    </w:tbl>
+    <w:p>
+      <w:r>
+        <w:br w:type="page"/>
+      </w:r>
+    </w:p>
+    <w:p>
+      <w:pPr>
+        <w:spacing w:before="0" w:after="40"/>
+        <w:jc w:val="center"/>
+      </w:pPr>
+      <w:r>
+        <w:drawing>
+          <wp:inline xmlns:a="http://schemas.openxmlformats.org/drawingml/2006/main" xmlns:pic="http://schemas.openxmlformats.org/drawingml/2006/picture">
+            <wp:extent cx="2377440" cy="502658"/>
+            <wp:docPr id="13" name="Picture 13"/>
+            <wp:cNvGraphicFramePr>
+              <a:graphicFrameLocks noChangeAspect="1"/>
+            </wp:cNvGraphicFramePr>
+            <a:graphic>
+              <a:graphicData uri="http://schemas.openxmlformats.org/drawingml/2006/picture">
+                <pic:pic>
+                  <pic:nvPicPr>
+                    <pic:cNvPr id="0" name="sreenidhi_logo.png"/>
+                    <pic:cNvPicPr/>
+                  </pic:nvPicPr>
+                  <pic:blipFill>
+                    <a:blip r:embed="rId20"/>
+                    <a:stretch>
+                      <a:fillRect/>
+                    </a:stretch>
+                  </pic:blipFill>
+                  <pic:spPr>
+                    <a:xfrm>
+                      <a:off x="0" y="0"/>
+                      <a:ext cx="2377440" cy="502658"/>
+                    </a:xfrm>
+                    <a:prstGeom prst="rect"/>
+                  </pic:spPr>
+                </pic:pic>
+              </a:graphicData>
+            </a:graphic>
+          </wp:inline>
+        </w:drawing>
+      </w:r>
+    </w:p>
+    <w:p>
+      <w:pPr>
+        <w:spacing w:before="0" w:after="80"/>
+        <w:jc w:val="center"/>
+      </w:pPr>
+      <w:r>
+        <w:rPr>
+          <w:rFonts w:ascii="Times New Roman" w:hAnsi="Times New Roman"/>
+          <w:b/>
+          <w:sz w:val="21"/>
+        </w:rPr>
+        <w:t>Yamnampet, Ghatkesar, Hyderabad 501301</w:t>
+      </w:r>
+    </w:p>
+    <w:p>
+      <w:pPr>
+        <w:spacing w:before="0" w:after="240"/>
+        <w:pBdr>
+          <w:bottom w:val="single" w:sz="12" w:space="1" w:color="000000"/>
+        </w:pBdr>
+      </w:pPr>
+    </w:p>
+    <w:p>
+      <w:pPr>
+        <w:spacing w:before="0" w:after="280"/>
+        <w:jc w:val="center"/>
+      </w:pPr>
+      <w:r>
+        <w:rPr>
+          <w:rFonts w:ascii="Times New Roman" w:hAnsi="Times New Roman"/>
+          <w:b/>
+          <w:color w:val="285782"/>
+          <w:sz w:val="30"/>
+        </w:rPr>
+        <w:t>CERTIFICATE</w:t>
+      </w:r>
+    </w:p>
+    <w:p>
+      <w:pPr>
+        <w:spacing w:line="312" w:lineRule="auto" w:after="200"/>
+        <w:jc w:val="both"/>
+      </w:pPr>
+      <w:r>
+        <w:t xml:space="preserve">This is to certify that the technical writing entitled </w:t>
+      </w:r>
       <w:r>
         <w:rPr>
           <w:b/>
-          <w:color w:val="002855"/>
-          <w:sz w:val="32"/>
+          <w:i/>
         </w:rPr>
-        <w:lastRenderedPageBreak/>
-        <w:t>CERTIFICATE</w:t>
+        <w:t>“AI-Generated Image Detection Using Deep Learning”</w:t>
+      </w:r>
+      <w:r>
+        <w:t xml:space="preserve"> submitted by </w:t>
+      </w:r>
+      <w:r>
+        <w:rPr>
+          <w:b/>
+        </w:rPr>
+        <w:t>Bojja Sahasra, Mudigonda Lalitha Sreya, Rohan Joshua Francis</w:t>
+      </w:r>
+      <w:r>
+        <w:t xml:space="preserve"> in partial fulfillment of the requirements for the award of the </w:t>
+      </w:r>
+      <w:r>
+        <w:rPr>
+          <w:b/>
+        </w:rPr>
+        <w:t>Bachelor of Technology (B.Tech) degree in Computer Science and Engineering</w:t>
+      </w:r>
+      <w:r>
+        <w:t>, is a genuine record of work carried out by them under our guidance and supervision during the academic year 2026-2027.</w:t>
       </w:r>
     </w:p>
     <w:p>
       <w:pPr>
-        <w:spacing w:after="120"/>
-      </w:pPr>
-      <w:r>
-        <w:t>This is to certify that the mini-project report entitled "AI-Generated Image Detection Using Deep Learning" is a bona fide record of work carried out by Bojja Sahasra (Roll No: 2401100CSE0243), Rohan Joshua Francis (Roll No: 2401100CSE0275), and Mudigonda Lalitha Sreya (Roll No: 2401100CSE0264) in partial fulfillment of the requirements for the award of the degree of Bachelor of Technology in Computer Science and Engineering from Sreenidhi University during the academic year 2026–2027.</w:t>
+        <w:spacing w:line="312" w:lineRule="auto" w:after="440"/>
+        <w:jc w:val="both"/>
+      </w:pPr>
+      <w:r>
+        <w:t>The reports presented in this technical writing have been verified and deemed satisfactory. We acknowledge the commitment, diligence, and innovative thinking demonstrated by the student in completing this technical writing course. Furthermore, we confirm that this work has not been submitted to any other University or Institution for the award of any degree, diploma, or certification.</w:t>
+      </w:r>
+    </w:p>
+    <w:tbl>
+      <w:tblPr>
+        <w:tblW w:type="auto" w:w="0"/>
+        <w:jc w:val="center"/>
+        <w:tblLook w:firstColumn="1" w:firstRow="1" w:lastColumn="0" w:lastRow="0" w:noHBand="0" w:noVBand="1" w:val="04A0"/>
+        <w:tblBorders>
+          <w:top w:val="none" w:sz="4" w:space="0" w:color="000000"/>
+          <w:left w:val="none" w:sz="4" w:space="0" w:color="000000"/>
+          <w:bottom w:val="none" w:sz="4" w:space="0" w:color="000000"/>
+          <w:right w:val="none" w:sz="4" w:space="0" w:color="000000"/>
+          <w:insideH w:val="none" w:sz="4" w:space="0" w:color="000000"/>
+          <w:insideV w:val="none" w:sz="4" w:space="0" w:color="000000"/>
+        </w:tblBorders>
+      </w:tblPr>
+      <w:tblGrid>
+        <w:gridCol w:w="4154"/>
+        <w:gridCol w:w="4154"/>
+      </w:tblGrid>
+      <w:tr>
+        <w:tc>
+          <w:tcPr>
+            <w:tcW w:type="dxa" w:w="4608"/>
+          </w:tcPr>
+          <w:p>
+            <w:pPr>
+              <w:spacing w:line="276" w:lineRule="auto"/>
+            </w:pPr>
+            <w:r>
+              <w:rPr>
+                <w:rFonts w:ascii="Times New Roman" w:hAnsi="Times New Roman"/>
+                <w:b/>
+                <w:sz w:val="21"/>
+              </w:rPr>
+              <w:t>Internal guide</w:t>
+              <w:br/>
+              <w:br/>
+            </w:r>
+            <w:r>
+              <w:rPr>
+                <w:rFonts w:ascii="Times New Roman" w:hAnsi="Times New Roman"/>
+                <w:b/>
+                <w:sz w:val="21"/>
+              </w:rPr>
+              <w:t>Dr. Saritha Bantu</w:t>
+              <w:br/>
+            </w:r>
+            <w:r>
+              <w:rPr>
+                <w:rFonts w:ascii="Times New Roman" w:hAnsi="Times New Roman"/>
+                <w:sz w:val="20"/>
+              </w:rPr>
+              <w:t>Professor</w:t>
+              <w:br/>
+              <w:t>Department of CSE</w:t>
+            </w:r>
+          </w:p>
+        </w:tc>
+        <w:tc>
+          <w:tcPr>
+            <w:tcW w:type="dxa" w:w="4608"/>
+          </w:tcPr>
+          <w:p>
+            <w:pPr>
+              <w:spacing w:line="276" w:lineRule="auto"/>
+            </w:pPr>
+            <w:r>
+              <w:rPr>
+                <w:rFonts w:ascii="Times New Roman" w:hAnsi="Times New Roman"/>
+                <w:b/>
+                <w:sz w:val="21"/>
+              </w:rPr>
+              <w:t>Technical Writing Coordinator</w:t>
+              <w:br/>
+              <w:br/>
+            </w:r>
+            <w:r>
+              <w:rPr>
+                <w:rFonts w:ascii="Times New Roman" w:hAnsi="Times New Roman"/>
+                <w:b/>
+                <w:sz w:val="21"/>
+              </w:rPr>
+              <w:t>Dr. G. Thirupathi</w:t>
+              <w:br/>
+            </w:r>
+            <w:r>
+              <w:rPr>
+                <w:rFonts w:ascii="Times New Roman" w:hAnsi="Times New Roman"/>
+                <w:sz w:val="20"/>
+              </w:rPr>
+              <w:t>Associate Professor</w:t>
+              <w:br/>
+              <w:t>Department of CSE</w:t>
+            </w:r>
+          </w:p>
+        </w:tc>
+      </w:tr>
+    </w:tbl>
+    <w:tbl>
+      <w:tblPr>
+        <w:tblW w:type="auto" w:w="0"/>
+        <w:jc w:val="center"/>
+        <w:tblLook w:firstColumn="1" w:firstRow="1" w:lastColumn="0" w:lastRow="0" w:noHBand="0" w:noVBand="1" w:val="04A0"/>
+        <w:tblBorders>
+          <w:top w:val="none" w:sz="4" w:space="0" w:color="000000"/>
+          <w:left w:val="none" w:sz="4" w:space="0" w:color="000000"/>
+          <w:bottom w:val="none" w:sz="4" w:space="0" w:color="000000"/>
+          <w:right w:val="none" w:sz="4" w:space="0" w:color="000000"/>
+          <w:insideH w:val="none" w:sz="4" w:space="0" w:color="000000"/>
+          <w:insideV w:val="none" w:sz="4" w:space="0" w:color="000000"/>
+        </w:tblBorders>
+      </w:tblPr>
+      <w:tblGrid>
+        <w:gridCol w:w="4154"/>
+        <w:gridCol w:w="4154"/>
+      </w:tblGrid>
+      <w:tr>
+        <w:tc>
+          <w:tcPr>
+            <w:tcW w:type="dxa" w:w="4608"/>
+          </w:tcPr>
+          <w:p>
+            <w:pPr>
+              <w:spacing w:before="400" w:line="276" w:lineRule="auto"/>
+            </w:pPr>
+            <w:r>
+              <w:rPr>
+                <w:rFonts w:ascii="Times New Roman" w:hAnsi="Times New Roman"/>
+                <w:sz w:val="20"/>
+              </w:rPr>
+              <w:t>Signature of the Head of the Dept.:</w:t>
+              <w:br/>
+              <w:t>Date:</w:t>
+            </w:r>
+          </w:p>
+        </w:tc>
+        <w:tc>
+          <w:tcPr>
+            <w:tcW w:type="dxa" w:w="4608"/>
+          </w:tcPr>
+          <w:p>
+            <w:pPr>
+              <w:spacing w:before="400" w:line="276" w:lineRule="auto"/>
+            </w:pPr>
+            <w:r>
+              <w:rPr>
+                <w:rFonts w:ascii="Times New Roman" w:hAnsi="Times New Roman"/>
+                <w:sz w:val="20"/>
+              </w:rPr>
+              <w:t>Signature of the Dean of SOE:</w:t>
+              <w:br/>
+              <w:t>Date:</w:t>
+            </w:r>
+          </w:p>
+        </w:tc>
+      </w:tr>
+    </w:tbl>
+    <w:p>
+      <w:r>
+        <w:br w:type="page"/>
       </w:r>
     </w:p>
     <w:p>
       <w:pPr>
-        <w:spacing w:after="120"/>
-      </w:pPr>
-      <w:r>
-        <w:t>The results embodied in this report have been carried out under our supervision and guidance. The technical details, implementation pipelines, and evaluation protocols presented herein satisfy the academic and scientific standards set forth by the Department of Computer Science and Engineering, Sreenidhi University.</w:t>
+        <w:spacing w:before="160" w:after="320"/>
+        <w:jc w:val="center"/>
+      </w:pPr>
+      <w:r>
+        <w:rPr>
+          <w:rFonts w:ascii="Times New Roman" w:hAnsi="Times New Roman"/>
+          <w:b/>
+          <w:sz w:val="30"/>
+        </w:rPr>
+        <w:t>STUDENT DECLARATION</w:t>
       </w:r>
     </w:p>
     <w:p>
       <w:pPr>
-        <w:spacing w:after="120"/>
-      </w:pPr>
+        <w:spacing w:line="312" w:lineRule="auto" w:after="240"/>
+        <w:jc w:val="both"/>
+      </w:pPr>
+      <w:r>
+        <w:t>We hereby declare that the technical writing report entitled "</w:t>
+      </w:r>
+      <w:r>
+        <w:rPr>
+          <w:b/>
+        </w:rPr>
+        <w:t>AI-Generated Image Detection Using Deep Learning</w:t>
+      </w:r>
+      <w:r>
+        <w:t>", submitted to the Department of Computer Science and Engineering, Sreenidhi University, in partial fulfillment of the requirements for the award of the degree of Bachelor of Technology in Computer Science and Engineering, is an authentic record of our own investigative and engineering work.</w:t>
+      </w:r>
     </w:p>
     <w:p>
       <w:pPr>
-        <w:spacing w:after="120"/>
-      </w:pPr>
+        <w:spacing w:line="312" w:lineRule="auto" w:after="480"/>
+        <w:jc w:val="both"/>
+      </w:pPr>
+      <w:r>
+        <w:t>We further affirm that all external intellectual inputs, research articles, standard algorithmic implementations, datasets (specifically the CIFAKE benchmark), and open-source software libraries utilized during the execution of this work have been explicitly acknowledged and cited in accordance with IEEE referencing standards. This report contains no plagiarism or unauthorized reproduction of published literature beyond accepted academic quotation thresholds, and this work has not been previously submitted in part or full for any other degree or diploma at this or any other educational institution.</w:t>
+      </w:r>
     </w:p>
     <w:p>
       <w:pPr>
-        <w:spacing w:after="120"/>
-      </w:pPr>
-    </w:p>
-    <w:p>
-      <w:pPr>
-        <w:spacing w:after="120"/>
-      </w:pPr>
-    </w:p>
-    <w:p>
-      <w:pPr>
-        <w:spacing w:after="120"/>
-      </w:pPr>
-    </w:p>
-    <w:p>
-      <w:pPr>
-        <w:spacing w:after="120"/>
-      </w:pPr>
-    </w:p>
-    <w:p>
-      <w:pPr>
-        <w:spacing w:after="120"/>
-      </w:pPr>
-    </w:p>
-    <w:p>
-      <w:pPr>
-        <w:spacing w:after="120"/>
-      </w:pPr>
-    </w:p>
-    <w:p>
-      <w:pPr>
-        <w:spacing w:after="120"/>
-      </w:pPr>
-    </w:p>
-    <w:p>
-      <w:pPr>
-        <w:spacing w:after="120"/>
-      </w:pPr>
-    </w:p>
-    <w:p>
-      <w:pPr>
-        <w:spacing w:after="120"/>
-      </w:pPr>
-    </w:p>
-    <w:p>
-      <w:pPr>
-        <w:spacing w:after="120"/>
-      </w:pPr>
-    </w:p>
-    <w:p>
-      <w:pPr>
-        <w:spacing w:after="120"/>
-      </w:pPr>
-    </w:p>
-    <w:p>
-      <w:pPr>
-        <w:spacing w:after="120"/>
-      </w:pPr>
-    </w:p>
-    <w:p>
-      <w:pPr>
-        <w:spacing w:after="120"/>
-      </w:pPr>
-    </w:p>
-    <w:p>
-      <w:pPr>
-        <w:spacing w:before="360" w:line="312" w:lineRule="auto"/>
-        <w:jc w:val="left"/>
-      </w:pPr>
-      <w:r>
-        <w:rPr>
-          <w:b/>
-          <w:color w:val="002855"/>
-          <w:sz w:val="32"/>
-        </w:rPr>
-        <w:lastRenderedPageBreak/>
-        <w:t>STUDENT DECLARATION</w:t>
-      </w:r>
-    </w:p>
-    <w:p>
-      <w:pPr>
-        <w:spacing w:after="120"/>
-      </w:pPr>
-      <w:r>
-        <w:t>We hereby declare that the mini-project report entitled "AI-Generated Image Detection Using Deep Learning", submitted to the Department of Computer Science and Engineering, Sreenidhi University, in partial fulfillment of the requirements for the award of the degree of Bachelor of Technology in Computer Science and Engineering, is an authentic record of our own investigative and engineering work.</w:t>
-      </w:r>
-    </w:p>
-    <w:p>
-      <w:pPr>
-        <w:spacing w:after="120"/>
-      </w:pPr>
-      <w:r>
-        <w:t xml:space="preserve">We further affirm that all external intellectual inputs, research articles, standard algorithmic implementations, datasets (specifically the CIFAKE benchmark), and open-source software libraries utilized during the execution of this work have been explicitly acknowledged and cited in accordance with IEEE referencing standards. This report contains no plagiarism or unauthorized reproduction of published literature beyond accepted academic quotation thresholds, and this work has not been previously submitted </w:t>
-      </w:r>
-      <w:r>
-        <w:t>in part or full for any other degree or diploma at this or any other educational institution.</w:t>
-      </w:r>
-    </w:p>
-    <w:p>
-      <w:r>
-        <w:br w:type="page"/>
-      </w:r>
-    </w:p>
-    <w:p>
-      <w:pPr>
-        <w:spacing w:before="360" w:line="312" w:lineRule="auto"/>
-        <w:jc w:val="left"/>
-      </w:pPr>
-      <w:r>
-        <w:rPr>
-          <w:b/>
-          <w:color w:val="002855"/>
-          <w:sz w:val="32"/>
-        </w:rPr>
-        <w:lastRenderedPageBreak/>
-        <w:t>ACKNOWLEDGEMENT</w:t>
-      </w:r>
-    </w:p>
-    <w:p>
-      <w:pPr>
-        <w:spacing w:after="120"/>
-      </w:pPr>
-      <w:r>
-        <w:t>The successful conceptualization, engineering, and empirical realization of this mini-project would not have been possible without the encouragement, technical counsel, and institutional support extended by numerous individuals and faculties at Sreenidhi University.</w:t>
-      </w:r>
-    </w:p>
-    <w:p>
-      <w:pPr>
-        <w:spacing w:after="120"/>
-      </w:pPr>
-      <w:r>
-        <w:t>First and foremost, we express our profound sense of gratitude and sincere indebtedness to our respected Course Coordinator and Project Guide, Dr. Saritha Bantu, Professor, Department of Computer Science and Engineering, for providing insightful mentorship, constructive criticism, and methodical guidance throughout every phase of this investigation. Her domain expertise in computer vision, deep learning architectures, and academic research provided invaluable clarity during architectural design, hyperparame</w:t>
-      </w:r>
-      <w:r>
-        <w:t>ter tuning, and performance benchmarking.</w:t>
-      </w:r>
-    </w:p>
-    <w:p>
-      <w:pPr>
-        <w:spacing w:after="120"/>
-      </w:pPr>
-      <w:r>
-        <w:t>We also extend our earnest gratitude to the Head of the Department of Computer Science and Engineering and the University Administration for providing the necessary infrastructural facilities, high-performance computational hardware environments, and departmental support essential for deep learning experimentation.</w:t>
-      </w:r>
-    </w:p>
-    <w:p>
-      <w:pPr>
-        <w:spacing w:after="120"/>
-      </w:pPr>
-      <w:r>
-        <w:t>We place on record our appreciation to all faculty members, technical laboratory assistants, and administrative staff of the Department of Computer Science and Engineering who directly or indirectly aided our technical inquiries. Finally, we thank our families and peers for their continuous moral support and encouragement throughout our academic endeavors.</w:t>
+        <w:spacing w:before="480" w:line="312" w:lineRule="auto"/>
+      </w:pPr>
+      <w:r>
+        <w:t>Bojja Sahasra (Roll No: 2401100CSE0243)</w:t>
+        <w:br/>
+      </w:r>
+      <w:r>
+        <w:t>Mudigonda Lalitha Sreya (Roll No: 2401100CSE0264)</w:t>
+        <w:br/>
+      </w:r>
+      <w:r>
+        <w:t>Rohan Joshua Francis (Roll No: 2401100CSE0275)</w:t>
+        <w:br/>
+        <w:br/>
+      </w:r>
+      <w:r>
+        <w:t>Date: October 2026</w:t>
+        <w:br/>
+        <w:t>Place: Hyderabad</w:t>
       </w:r>
     </w:p>
     <w:p>
@@ -632,7 +1357,7 @@
               <w:rPr>
                 <w:sz w:val="20"/>
               </w:rPr>
-              <w:t>Title Page, Certificate, Declaration, Acknowledgement, Abstract</w:t>
+              <w:t>Title Page, Acknowledgment, Certificate, Student Declaration, Abstract</w:t>
             </w:r>
           </w:p>
         </w:tc>

</xml_diff>

<commit_message>
Fix table cell alignments and spacing on Certificate and preliminary pages to eliminate text justification artifacts
</commit_message>
<xml_diff>
--- a/report/AI_Generated_Image_Detection_Project_Report.docx
+++ b/report/AI_Generated_Image_Detection_Project_Report.docx
@@ -19,7 +19,7 @@
               <a:graphicData uri="http://schemas.openxmlformats.org/drawingml/2006/picture">
                 <pic:pic>
                   <pic:nvPicPr>
-                    <pic:cNvPr id="0" name="sreenidhi_logo.png"/>
+                    <pic:cNvPr id="0" name="image.png"/>
                     <pic:cNvPicPr/>
                   </pic:nvPicPr>
                   <pic:blipFill>
@@ -163,12 +163,16 @@
           </w:tcPr>
           <w:p>
             <w:pPr>
+              <w:spacing w:before="0" w:after="0" w:line="276" w:lineRule="auto"/>
               <w:jc w:val="center"/>
             </w:pPr>
+            <w:r/>
             <w:r>
               <w:rPr>
                 <w:rFonts w:ascii="Times New Roman" w:hAnsi="Times New Roman"/>
                 <w:b/>
+                <w:i w:val="0"/>
+                <w:color w:val="000000"/>
                 <w:sz w:val="21"/>
               </w:rPr>
               <w:t>Batch No. B31</w:t>
@@ -189,11 +193,16 @@
           </w:tcPr>
           <w:p>
             <w:pPr>
-              <w:jc w:val="left"/>
-            </w:pPr>
+              <w:spacing w:before="0" w:after="0" w:line="276" w:lineRule="auto"/>
+              <w:jc w:val="left"/>
+            </w:pPr>
+            <w:r/>
             <w:r>
               <w:rPr>
                 <w:rFonts w:ascii="Times New Roman" w:hAnsi="Times New Roman"/>
+                <w:b w:val="0"/>
+                <w:i w:val="0"/>
+                <w:color w:val="000000"/>
                 <w:sz w:val="20"/>
               </w:rPr>
               <w:t>Bojja Sahasra</w:t>
@@ -212,12 +221,16 @@
           </w:tcPr>
           <w:p>
             <w:pPr>
+              <w:spacing w:before="0" w:after="0" w:line="276" w:lineRule="auto"/>
               <w:jc w:val="center"/>
             </w:pPr>
+            <w:r/>
             <w:r>
               <w:rPr>
                 <w:rFonts w:ascii="Times New Roman" w:hAnsi="Times New Roman"/>
                 <w:b/>
+                <w:i w:val="0"/>
+                <w:color w:val="000000"/>
                 <w:sz w:val="20"/>
               </w:rPr>
               <w:t>2401100CSE0243</w:t>
@@ -238,11 +251,16 @@
           </w:tcPr>
           <w:p>
             <w:pPr>
-              <w:jc w:val="left"/>
-            </w:pPr>
+              <w:spacing w:before="0" w:after="0" w:line="276" w:lineRule="auto"/>
+              <w:jc w:val="left"/>
+            </w:pPr>
+            <w:r/>
             <w:r>
               <w:rPr>
                 <w:rFonts w:ascii="Times New Roman" w:hAnsi="Times New Roman"/>
+                <w:b w:val="0"/>
+                <w:i w:val="0"/>
+                <w:color w:val="000000"/>
                 <w:sz w:val="20"/>
               </w:rPr>
               <w:t>Mudigonda Lalitha Sreya</w:t>
@@ -261,12 +279,16 @@
           </w:tcPr>
           <w:p>
             <w:pPr>
+              <w:spacing w:before="0" w:after="0" w:line="276" w:lineRule="auto"/>
               <w:jc w:val="center"/>
             </w:pPr>
+            <w:r/>
             <w:r>
               <w:rPr>
                 <w:rFonts w:ascii="Times New Roman" w:hAnsi="Times New Roman"/>
                 <w:b/>
+                <w:i w:val="0"/>
+                <w:color w:val="000000"/>
                 <w:sz w:val="20"/>
               </w:rPr>
               <w:t>2401100CSE0264</w:t>
@@ -287,11 +309,16 @@
           </w:tcPr>
           <w:p>
             <w:pPr>
-              <w:jc w:val="left"/>
-            </w:pPr>
+              <w:spacing w:before="0" w:after="0" w:line="276" w:lineRule="auto"/>
+              <w:jc w:val="left"/>
+            </w:pPr>
+            <w:r/>
             <w:r>
               <w:rPr>
                 <w:rFonts w:ascii="Times New Roman" w:hAnsi="Times New Roman"/>
+                <w:b w:val="0"/>
+                <w:i w:val="0"/>
+                <w:color w:val="000000"/>
                 <w:sz w:val="20"/>
               </w:rPr>
               <w:t>Rohan Joshua Francis</w:t>
@@ -310,12 +337,16 @@
           </w:tcPr>
           <w:p>
             <w:pPr>
+              <w:spacing w:before="0" w:after="0" w:line="276" w:lineRule="auto"/>
               <w:jc w:val="center"/>
             </w:pPr>
+            <w:r/>
             <w:r>
               <w:rPr>
                 <w:rFonts w:ascii="Times New Roman" w:hAnsi="Times New Roman"/>
                 <w:b/>
+                <w:i w:val="0"/>
+                <w:color w:val="000000"/>
                 <w:sz w:val="20"/>
               </w:rPr>
               <w:t>2401100CSE0275</w:t>
@@ -576,12 +607,16 @@
           </w:tcPr>
           <w:p>
             <w:pPr>
+              <w:spacing w:before="0" w:after="0" w:line="276" w:lineRule="auto"/>
               <w:jc w:val="center"/>
             </w:pPr>
+            <w:r/>
             <w:r>
               <w:rPr>
                 <w:rFonts w:ascii="Times New Roman" w:hAnsi="Times New Roman"/>
                 <w:b/>
+                <w:i w:val="0"/>
+                <w:color w:val="000000"/>
                 <w:sz w:val="20"/>
               </w:rPr>
               <w:t>2401100CSE0243</w:t>
@@ -600,12 +635,16 @@
           </w:tcPr>
           <w:p>
             <w:pPr>
-              <w:jc w:val="left"/>
-            </w:pPr>
+              <w:spacing w:before="0" w:after="0" w:line="276" w:lineRule="auto"/>
+              <w:jc w:val="left"/>
+            </w:pPr>
+            <w:r/>
             <w:r>
               <w:rPr>
                 <w:rFonts w:ascii="Times New Roman" w:hAnsi="Times New Roman"/>
                 <w:b/>
+                <w:i w:val="0"/>
+                <w:color w:val="000000"/>
                 <w:sz w:val="20"/>
               </w:rPr>
               <w:t>Bojja Sahasra</w:t>
@@ -624,11 +663,16 @@
           </w:tcPr>
           <w:p>
             <w:pPr>
+              <w:spacing w:before="0" w:after="0" w:line="276" w:lineRule="auto"/>
               <w:jc w:val="center"/>
             </w:pPr>
+            <w:r/>
             <w:r>
               <w:rPr>
                 <w:rFonts w:ascii="Times New Roman" w:hAnsi="Times New Roman"/>
+                <w:b w:val="0"/>
+                <w:i w:val="0"/>
+                <w:color w:val="000000"/>
                 <w:sz w:val="20"/>
               </w:rPr>
               <w:t>Sahasra</w:t>
@@ -649,12 +693,16 @@
           </w:tcPr>
           <w:p>
             <w:pPr>
+              <w:spacing w:before="0" w:after="0" w:line="276" w:lineRule="auto"/>
               <w:jc w:val="center"/>
             </w:pPr>
+            <w:r/>
             <w:r>
               <w:rPr>
                 <w:rFonts w:ascii="Times New Roman" w:hAnsi="Times New Roman"/>
                 <w:b/>
+                <w:i w:val="0"/>
+                <w:color w:val="000000"/>
                 <w:sz w:val="20"/>
               </w:rPr>
               <w:t>2401100CSE0264</w:t>
@@ -673,12 +721,16 @@
           </w:tcPr>
           <w:p>
             <w:pPr>
-              <w:jc w:val="left"/>
-            </w:pPr>
+              <w:spacing w:before="0" w:after="0" w:line="276" w:lineRule="auto"/>
+              <w:jc w:val="left"/>
+            </w:pPr>
+            <w:r/>
             <w:r>
               <w:rPr>
                 <w:rFonts w:ascii="Times New Roman" w:hAnsi="Times New Roman"/>
                 <w:b/>
+                <w:i w:val="0"/>
+                <w:color w:val="000000"/>
                 <w:sz w:val="20"/>
               </w:rPr>
               <w:t>Mudigonda Lalitha Sreya</w:t>
@@ -697,11 +749,16 @@
           </w:tcPr>
           <w:p>
             <w:pPr>
+              <w:spacing w:before="0" w:after="0" w:line="276" w:lineRule="auto"/>
               <w:jc w:val="center"/>
             </w:pPr>
+            <w:r/>
             <w:r>
               <w:rPr>
                 <w:rFonts w:ascii="Times New Roman" w:hAnsi="Times New Roman"/>
+                <w:b w:val="0"/>
+                <w:i w:val="0"/>
+                <w:color w:val="000000"/>
                 <w:sz w:val="20"/>
               </w:rPr>
               <w:t>Lalitha</w:t>
@@ -722,12 +779,16 @@
           </w:tcPr>
           <w:p>
             <w:pPr>
+              <w:spacing w:before="0" w:after="0" w:line="276" w:lineRule="auto"/>
               <w:jc w:val="center"/>
             </w:pPr>
+            <w:r/>
             <w:r>
               <w:rPr>
                 <w:rFonts w:ascii="Times New Roman" w:hAnsi="Times New Roman"/>
                 <w:b/>
+                <w:i w:val="0"/>
+                <w:color w:val="000000"/>
                 <w:sz w:val="20"/>
               </w:rPr>
               <w:t>2401100CSE0275</w:t>
@@ -746,12 +807,16 @@
           </w:tcPr>
           <w:p>
             <w:pPr>
-              <w:jc w:val="left"/>
-            </w:pPr>
+              <w:spacing w:before="0" w:after="0" w:line="276" w:lineRule="auto"/>
+              <w:jc w:val="left"/>
+            </w:pPr>
+            <w:r/>
             <w:r>
               <w:rPr>
                 <w:rFonts w:ascii="Times New Roman" w:hAnsi="Times New Roman"/>
                 <w:b/>
+                <w:i w:val="0"/>
+                <w:color w:val="000000"/>
                 <w:sz w:val="20"/>
               </w:rPr>
               <w:t>Rohan Joshua Francis</w:t>
@@ -770,11 +835,16 @@
           </w:tcPr>
           <w:p>
             <w:pPr>
+              <w:spacing w:before="0" w:after="0" w:line="276" w:lineRule="auto"/>
               <w:jc w:val="center"/>
             </w:pPr>
+            <w:r/>
             <w:r>
               <w:rPr>
                 <w:rFonts w:ascii="Times New Roman" w:hAnsi="Times New Roman"/>
+                <w:b w:val="0"/>
+                <w:i w:val="0"/>
+                <w:color w:val="000000"/>
                 <w:sz w:val="20"/>
               </w:rPr>
               <w:t>Rohan</w:t>
@@ -805,7 +875,7 @@
               <a:graphicData uri="http://schemas.openxmlformats.org/drawingml/2006/picture">
                 <pic:pic>
                   <pic:nvPicPr>
-                    <pic:cNvPr id="0" name="sreenidhi_logo.png"/>
+                    <pic:cNvPr id="0" name="image.png"/>
                     <pic:cNvPicPr/>
                   </pic:nvPicPr>
                   <pic:blipFill>
@@ -904,7 +974,7 @@
     </w:p>
     <w:p>
       <w:pPr>
-        <w:spacing w:line="312" w:lineRule="auto" w:after="440"/>
+        <w:spacing w:line="312" w:lineRule="auto" w:after="480"/>
         <w:jc w:val="both"/>
       </w:pPr>
       <w:r>
@@ -932,135 +1002,242 @@
       <w:tr>
         <w:tc>
           <w:tcPr>
-            <w:tcW w:type="dxa" w:w="4608"/>
-          </w:tcPr>
-          <w:p>
-            <w:pPr>
-              <w:spacing w:line="276" w:lineRule="auto"/>
-            </w:pPr>
+            <w:tcW w:type="dxa" w:w="4752"/>
+            <w:tcMar>
+              <w:top w:w="0" w:type="dxa"/>
+              <w:bottom w:w="0" w:type="dxa"/>
+              <w:left w:w="60" w:type="dxa"/>
+              <w:right w:w="60" w:type="dxa"/>
+            </w:tcMar>
+          </w:tcPr>
+          <w:p>
+            <w:pPr>
+              <w:spacing w:before="0" w:after="640" w:line="276" w:lineRule="auto"/>
+              <w:jc w:val="left"/>
+            </w:pPr>
+            <w:r/>
             <w:r>
               <w:rPr>
                 <w:rFonts w:ascii="Times New Roman" w:hAnsi="Times New Roman"/>
                 <w:b/>
-                <w:sz w:val="21"/>
+                <w:i w:val="0"/>
+                <w:color w:val="000000"/>
+                <w:sz w:val="22"/>
               </w:rPr>
               <w:t>Internal guide</w:t>
-              <w:br/>
-              <w:br/>
-            </w:r>
+            </w:r>
+          </w:p>
+          <w:p>
+            <w:pPr>
+              <w:spacing w:before="0" w:after="40" w:line="276" w:lineRule="auto"/>
+              <w:jc w:val="left"/>
+            </w:pPr>
             <w:r>
               <w:rPr>
                 <w:rFonts w:ascii="Times New Roman" w:hAnsi="Times New Roman"/>
                 <w:b/>
+                <w:i w:val="0"/>
+                <w:color w:val="000000"/>
+                <w:sz w:val="22"/>
+              </w:rPr>
+              <w:t>Dr. Saritha Bantu</w:t>
+            </w:r>
+          </w:p>
+          <w:p>
+            <w:pPr>
+              <w:spacing w:before="0" w:after="40" w:line="276" w:lineRule="auto"/>
+              <w:jc w:val="left"/>
+            </w:pPr>
+            <w:r>
+              <w:rPr>
+                <w:rFonts w:ascii="Times New Roman" w:hAnsi="Times New Roman"/>
+                <w:b w:val="0"/>
+                <w:i w:val="0"/>
+                <w:color w:val="000000"/>
                 <w:sz w:val="21"/>
               </w:rPr>
-              <w:t>Dr. Saritha Bantu</w:t>
-              <w:br/>
-            </w:r>
+              <w:t>Professor</w:t>
+            </w:r>
+          </w:p>
+          <w:p>
+            <w:pPr>
+              <w:spacing w:before="0" w:after="0" w:line="276" w:lineRule="auto"/>
+              <w:jc w:val="left"/>
+            </w:pPr>
             <w:r>
               <w:rPr>
                 <w:rFonts w:ascii="Times New Roman" w:hAnsi="Times New Roman"/>
-                <w:sz w:val="20"/>
-              </w:rPr>
-              <w:t>Professor</w:t>
-              <w:br/>
+                <w:b w:val="0"/>
+                <w:i w:val="0"/>
+                <w:color w:val="000000"/>
+                <w:sz w:val="21"/>
+              </w:rPr>
               <w:t>Department of CSE</w:t>
             </w:r>
           </w:p>
         </w:tc>
         <w:tc>
           <w:tcPr>
-            <w:tcW w:type="dxa" w:w="4608"/>
-          </w:tcPr>
-          <w:p>
-            <w:pPr>
-              <w:spacing w:line="276" w:lineRule="auto"/>
-            </w:pPr>
+            <w:tcW w:type="dxa" w:w="4176"/>
+            <w:tcMar>
+              <w:top w:w="0" w:type="dxa"/>
+              <w:bottom w:w="0" w:type="dxa"/>
+              <w:left w:w="60" w:type="dxa"/>
+              <w:right w:w="60" w:type="dxa"/>
+            </w:tcMar>
+          </w:tcPr>
+          <w:p>
+            <w:pPr>
+              <w:spacing w:before="0" w:after="640" w:line="276" w:lineRule="auto"/>
+              <w:jc w:val="left"/>
+            </w:pPr>
+            <w:r/>
             <w:r>
               <w:rPr>
                 <w:rFonts w:ascii="Times New Roman" w:hAnsi="Times New Roman"/>
                 <w:b/>
-                <w:sz w:val="21"/>
+                <w:i w:val="0"/>
+                <w:color w:val="000000"/>
+                <w:sz w:val="22"/>
               </w:rPr>
               <w:t>Technical Writing Coordinator</w:t>
-              <w:br/>
-              <w:br/>
-            </w:r>
+            </w:r>
+          </w:p>
+          <w:p>
+            <w:pPr>
+              <w:spacing w:before="0" w:after="40" w:line="276" w:lineRule="auto"/>
+              <w:jc w:val="left"/>
+            </w:pPr>
             <w:r>
               <w:rPr>
                 <w:rFonts w:ascii="Times New Roman" w:hAnsi="Times New Roman"/>
                 <w:b/>
+                <w:i w:val="0"/>
+                <w:color w:val="000000"/>
+                <w:sz w:val="22"/>
+              </w:rPr>
+              <w:t>Dr. G. Thirupathi</w:t>
+            </w:r>
+          </w:p>
+          <w:p>
+            <w:pPr>
+              <w:spacing w:before="0" w:after="40" w:line="276" w:lineRule="auto"/>
+              <w:jc w:val="left"/>
+            </w:pPr>
+            <w:r>
+              <w:rPr>
+                <w:rFonts w:ascii="Times New Roman" w:hAnsi="Times New Roman"/>
+                <w:b w:val="0"/>
+                <w:i w:val="0"/>
+                <w:color w:val="000000"/>
                 <w:sz w:val="21"/>
               </w:rPr>
-              <w:t>Dr. G. Thirupathi</w:t>
-              <w:br/>
-            </w:r>
+              <w:t>Associate Professor</w:t>
+            </w:r>
+          </w:p>
+          <w:p>
+            <w:pPr>
+              <w:spacing w:before="0" w:after="0" w:line="276" w:lineRule="auto"/>
+              <w:jc w:val="left"/>
+            </w:pPr>
             <w:r>
               <w:rPr>
                 <w:rFonts w:ascii="Times New Roman" w:hAnsi="Times New Roman"/>
-                <w:sz w:val="20"/>
-              </w:rPr>
-              <w:t>Associate Professor</w:t>
-              <w:br/>
+                <w:b w:val="0"/>
+                <w:i w:val="0"/>
+                <w:color w:val="000000"/>
+                <w:sz w:val="21"/>
+              </w:rPr>
               <w:t>Department of CSE</w:t>
             </w:r>
           </w:p>
         </w:tc>
       </w:tr>
-    </w:tbl>
-    <w:tbl>
-      <w:tblPr>
-        <w:tblW w:type="auto" w:w="0"/>
-        <w:jc w:val="center"/>
-        <w:tblLook w:firstColumn="1" w:firstRow="1" w:lastColumn="0" w:lastRow="0" w:noHBand="0" w:noVBand="1" w:val="04A0"/>
-        <w:tblBorders>
-          <w:top w:val="none" w:sz="4" w:space="0" w:color="000000"/>
-          <w:left w:val="none" w:sz="4" w:space="0" w:color="000000"/>
-          <w:bottom w:val="none" w:sz="4" w:space="0" w:color="000000"/>
-          <w:right w:val="none" w:sz="4" w:space="0" w:color="000000"/>
-          <w:insideH w:val="none" w:sz="4" w:space="0" w:color="000000"/>
-          <w:insideV w:val="none" w:sz="4" w:space="0" w:color="000000"/>
-        </w:tblBorders>
-      </w:tblPr>
-      <w:tblGrid>
-        <w:gridCol w:w="4154"/>
-        <w:gridCol w:w="4154"/>
-      </w:tblGrid>
       <w:tr>
         <w:tc>
           <w:tcPr>
-            <w:tcW w:type="dxa" w:w="4608"/>
-          </w:tcPr>
-          <w:p>
-            <w:pPr>
-              <w:spacing w:before="400" w:line="276" w:lineRule="auto"/>
-            </w:pPr>
+            <w:tcW w:type="dxa" w:w="4752"/>
+            <w:tcMar>
+              <w:top w:w="0" w:type="dxa"/>
+              <w:bottom w:w="0" w:type="dxa"/>
+              <w:left w:w="60" w:type="dxa"/>
+              <w:right w:w="60" w:type="dxa"/>
+            </w:tcMar>
+          </w:tcPr>
+          <w:p>
+            <w:pPr>
+              <w:spacing w:before="560" w:after="80" w:line="276" w:lineRule="auto"/>
+              <w:jc w:val="left"/>
+            </w:pPr>
+            <w:r/>
             <w:r>
               <w:rPr>
                 <w:rFonts w:ascii="Times New Roman" w:hAnsi="Times New Roman"/>
-                <w:sz w:val="20"/>
+                <w:b w:val="0"/>
+                <w:i w:val="0"/>
+                <w:color w:val="000000"/>
+                <w:sz w:val="21"/>
               </w:rPr>
               <w:t>Signature of the Head of the Dept.:</w:t>
-              <w:br/>
+            </w:r>
+          </w:p>
+          <w:p>
+            <w:pPr>
+              <w:spacing w:before="0" w:after="0" w:line="276" w:lineRule="auto"/>
+              <w:jc w:val="left"/>
+            </w:pPr>
+            <w:r>
+              <w:rPr>
+                <w:rFonts w:ascii="Times New Roman" w:hAnsi="Times New Roman"/>
+                <w:b w:val="0"/>
+                <w:i w:val="0"/>
+                <w:color w:val="000000"/>
+                <w:sz w:val="21"/>
+              </w:rPr>
               <w:t>Date:</w:t>
             </w:r>
           </w:p>
         </w:tc>
         <w:tc>
           <w:tcPr>
-            <w:tcW w:type="dxa" w:w="4608"/>
-          </w:tcPr>
-          <w:p>
-            <w:pPr>
-              <w:spacing w:before="400" w:line="276" w:lineRule="auto"/>
-            </w:pPr>
+            <w:tcW w:type="dxa" w:w="4176"/>
+            <w:tcMar>
+              <w:top w:w="0" w:type="dxa"/>
+              <w:bottom w:w="0" w:type="dxa"/>
+              <w:left w:w="60" w:type="dxa"/>
+              <w:right w:w="60" w:type="dxa"/>
+            </w:tcMar>
+          </w:tcPr>
+          <w:p>
+            <w:pPr>
+              <w:spacing w:before="560" w:after="80" w:line="276" w:lineRule="auto"/>
+              <w:jc w:val="left"/>
+            </w:pPr>
+            <w:r/>
             <w:r>
               <w:rPr>
                 <w:rFonts w:ascii="Times New Roman" w:hAnsi="Times New Roman"/>
-                <w:sz w:val="20"/>
+                <w:b w:val="0"/>
+                <w:i w:val="0"/>
+                <w:color w:val="000000"/>
+                <w:sz w:val="21"/>
               </w:rPr>
               <w:t>Signature of the Dean of SOE:</w:t>
-              <w:br/>
+            </w:r>
+          </w:p>
+          <w:p>
+            <w:pPr>
+              <w:spacing w:before="0" w:after="0" w:line="276" w:lineRule="auto"/>
+              <w:jc w:val="left"/>
+            </w:pPr>
+            <w:r>
+              <w:rPr>
+                <w:rFonts w:ascii="Times New Roman" w:hAnsi="Times New Roman"/>
+                <w:b w:val="0"/>
+                <w:i w:val="0"/>
+                <w:color w:val="000000"/>
+                <w:sz w:val="21"/>
+              </w:rPr>
               <w:t>Date:</w:t>
             </w:r>
           </w:p>

</xml_diff>

<commit_message>
Apply user review feedback: update plural pronoun in Acknowledgment, remove Coordinator and Dean from Certificate, and enclose Student Declaration in structured table
</commit_message>
<xml_diff>
--- a/report/AI_Generated_Image_Detection_Project_Report.docx
+++ b/report/AI_Generated_Image_Detection_Project_Report.docx
@@ -522,7 +522,7 @@
         <w:t>Dr. Padmaja Grandhe</w:t>
       </w:r>
       <w:r>
-        <w:t xml:space="preserve"> for his invaluable guidance and encouragement throughout this technical writing course.</w:t>
+        <w:t xml:space="preserve"> for their invaluable guidance and encouragement throughout this technical writing course.</w:t>
       </w:r>
     </w:p>
     <w:p>
@@ -974,7 +974,7 @@
     </w:p>
     <w:p>
       <w:pPr>
-        <w:spacing w:line="312" w:lineRule="auto" w:after="480"/>
+        <w:spacing w:line="312" w:lineRule="auto" w:after="720"/>
         <w:jc w:val="both"/>
       </w:pPr>
       <w:r>
@@ -1002,17 +1002,17 @@
       <w:tr>
         <w:tc>
           <w:tcPr>
-            <w:tcW w:type="dxa" w:w="4752"/>
+            <w:tcW w:type="dxa" w:w="4608"/>
             <w:tcMar>
               <w:top w:w="0" w:type="dxa"/>
               <w:bottom w:w="0" w:type="dxa"/>
-              <w:left w:w="60" w:type="dxa"/>
-              <w:right w:w="60" w:type="dxa"/>
-            </w:tcMar>
-          </w:tcPr>
-          <w:p>
-            <w:pPr>
-              <w:spacing w:before="0" w:after="640" w:line="276" w:lineRule="auto"/>
+              <w:left w:w="40" w:type="dxa"/>
+              <w:right w:w="40" w:type="dxa"/>
+            </w:tcMar>
+          </w:tcPr>
+          <w:p>
+            <w:pPr>
+              <w:spacing w:before="0" w:after="720" w:line="276" w:lineRule="auto"/>
               <w:jc w:val="left"/>
             </w:pPr>
             <w:r/>
@@ -1078,17 +1078,17 @@
         </w:tc>
         <w:tc>
           <w:tcPr>
-            <w:tcW w:type="dxa" w:w="4176"/>
+            <w:tcW w:type="dxa" w:w="4320"/>
             <w:tcMar>
               <w:top w:w="0" w:type="dxa"/>
               <w:bottom w:w="0" w:type="dxa"/>
-              <w:left w:w="60" w:type="dxa"/>
-              <w:right w:w="60" w:type="dxa"/>
-            </w:tcMar>
-          </w:tcPr>
-          <w:p>
-            <w:pPr>
-              <w:spacing w:before="0" w:after="640" w:line="276" w:lineRule="auto"/>
+              <w:left w:w="40" w:type="dxa"/>
+              <w:right w:w="40" w:type="dxa"/>
+            </w:tcMar>
+          </w:tcPr>
+          <w:p>
+            <w:pPr>
+              <w:spacing w:before="0" w:after="720" w:line="276" w:lineRule="auto"/>
               <w:jc w:val="left"/>
             </w:pPr>
             <w:r/>
@@ -1100,23 +1100,7 @@
                 <w:color w:val="000000"/>
                 <w:sz w:val="22"/>
               </w:rPr>
-              <w:t>Technical Writing Coordinator</w:t>
-            </w:r>
-          </w:p>
-          <w:p>
-            <w:pPr>
-              <w:spacing w:before="0" w:after="40" w:line="276" w:lineRule="auto"/>
-              <w:jc w:val="left"/>
-            </w:pPr>
-            <w:r>
-              <w:rPr>
-                <w:rFonts w:ascii="Times New Roman" w:hAnsi="Times New Roman"/>
-                <w:b/>
-                <w:i w:val="0"/>
-                <w:color w:val="000000"/>
-                <w:sz w:val="22"/>
-              </w:rPr>
-              <w:t>Dr. G. Thirupathi</w:t>
+              <w:t>Signature of the Head of the Dept.:</w:t>
             </w:r>
           </w:p>
           <w:p>
@@ -1132,12 +1116,12 @@
                 <w:color w:val="000000"/>
                 <w:sz w:val="21"/>
               </w:rPr>
-              <w:t>Associate Professor</w:t>
-            </w:r>
-          </w:p>
-          <w:p>
-            <w:pPr>
-              <w:spacing w:before="0" w:after="0" w:line="276" w:lineRule="auto"/>
+              <w:t>Department of CSE</w:t>
+            </w:r>
+          </w:p>
+          <w:p>
+            <w:pPr>
+              <w:spacing w:before="0" w:after="40" w:line="276" w:lineRule="auto"/>
               <w:jc w:val="left"/>
             </w:pPr>
             <w:r>
@@ -1148,81 +1132,7 @@
                 <w:color w:val="000000"/>
                 <w:sz w:val="21"/>
               </w:rPr>
-              <w:t>Department of CSE</w:t>
-            </w:r>
-          </w:p>
-        </w:tc>
-      </w:tr>
-      <w:tr>
-        <w:tc>
-          <w:tcPr>
-            <w:tcW w:type="dxa" w:w="4752"/>
-            <w:tcMar>
-              <w:top w:w="0" w:type="dxa"/>
-              <w:bottom w:w="0" w:type="dxa"/>
-              <w:left w:w="60" w:type="dxa"/>
-              <w:right w:w="60" w:type="dxa"/>
-            </w:tcMar>
-          </w:tcPr>
-          <w:p>
-            <w:pPr>
-              <w:spacing w:before="560" w:after="80" w:line="276" w:lineRule="auto"/>
-              <w:jc w:val="left"/>
-            </w:pPr>
-            <w:r/>
-            <w:r>
-              <w:rPr>
-                <w:rFonts w:ascii="Times New Roman" w:hAnsi="Times New Roman"/>
-                <w:b w:val="0"/>
-                <w:i w:val="0"/>
-                <w:color w:val="000000"/>
-                <w:sz w:val="21"/>
-              </w:rPr>
-              <w:t>Signature of the Head of the Dept.:</w:t>
-            </w:r>
-          </w:p>
-          <w:p>
-            <w:pPr>
-              <w:spacing w:before="0" w:after="0" w:line="276" w:lineRule="auto"/>
-              <w:jc w:val="left"/>
-            </w:pPr>
-            <w:r>
-              <w:rPr>
-                <w:rFonts w:ascii="Times New Roman" w:hAnsi="Times New Roman"/>
-                <w:b w:val="0"/>
-                <w:i w:val="0"/>
-                <w:color w:val="000000"/>
-                <w:sz w:val="21"/>
-              </w:rPr>
-              <w:t>Date:</w:t>
-            </w:r>
-          </w:p>
-        </w:tc>
-        <w:tc>
-          <w:tcPr>
-            <w:tcW w:type="dxa" w:w="4176"/>
-            <w:tcMar>
-              <w:top w:w="0" w:type="dxa"/>
-              <w:bottom w:w="0" w:type="dxa"/>
-              <w:left w:w="60" w:type="dxa"/>
-              <w:right w:w="60" w:type="dxa"/>
-            </w:tcMar>
-          </w:tcPr>
-          <w:p>
-            <w:pPr>
-              <w:spacing w:before="560" w:after="80" w:line="276" w:lineRule="auto"/>
-              <w:jc w:val="left"/>
-            </w:pPr>
-            <w:r/>
-            <w:r>
-              <w:rPr>
-                <w:rFonts w:ascii="Times New Roman" w:hAnsi="Times New Roman"/>
-                <w:b w:val="0"/>
-                <w:i w:val="0"/>
-                <w:color w:val="000000"/>
-                <w:sz w:val="21"/>
-              </w:rPr>
-              <w:t>Signature of the Dean of SOE:</w:t>
+              <w:t>Sreenidhi University</w:t>
             </w:r>
           </w:p>
           <w:p>
@@ -1283,31 +1193,357 @@
     </w:p>
     <w:p>
       <w:pPr>
-        <w:spacing w:line="312" w:lineRule="auto" w:after="480"/>
+        <w:spacing w:line="312" w:lineRule="auto" w:after="400"/>
         <w:jc w:val="both"/>
       </w:pPr>
       <w:r>
         <w:t>We further affirm that all external intellectual inputs, research articles, standard algorithmic implementations, datasets (specifically the CIFAKE benchmark), and open-source software libraries utilized during the execution of this work have been explicitly acknowledged and cited in accordance with IEEE referencing standards. This report contains no plagiarism or unauthorized reproduction of published literature beyond accepted academic quotation thresholds, and this work has not been previously submitted in part or full for any other degree or diploma at this or any other educational institution.</w:t>
       </w:r>
     </w:p>
+    <w:tbl>
+      <w:tblPr>
+        <w:tblW w:type="auto" w:w="0"/>
+        <w:jc w:val="center"/>
+        <w:tblLook w:firstColumn="1" w:firstRow="1" w:lastColumn="0" w:lastRow="0" w:noHBand="0" w:noVBand="1" w:val="04A0"/>
+        <w:tblBorders>
+          <w:top w:val="single" w:sz="4" w:space="0" w:color="000000"/>
+          <w:left w:val="single" w:sz="4" w:space="0" w:color="000000"/>
+          <w:bottom w:val="single" w:sz="4" w:space="0" w:color="000000"/>
+          <w:right w:val="single" w:sz="4" w:space="0" w:color="000000"/>
+          <w:insideH w:val="single" w:sz="4" w:space="0" w:color="000000"/>
+          <w:insideV w:val="single" w:sz="4" w:space="0" w:color="000000"/>
+        </w:tblBorders>
+      </w:tblPr>
+      <w:tblGrid>
+        <w:gridCol w:w="2770"/>
+        <w:gridCol w:w="2770"/>
+        <w:gridCol w:w="2770"/>
+      </w:tblGrid>
+      <w:tr>
+        <w:tc>
+          <w:tcPr>
+            <w:tcW w:type="dxa" w:w="2880"/>
+            <w:tcMar>
+              <w:top w:w="70" w:type="dxa"/>
+              <w:bottom w:w="70" w:type="dxa"/>
+              <w:left w:w="100" w:type="dxa"/>
+              <w:right w:w="100" w:type="dxa"/>
+            </w:tcMar>
+          </w:tcPr>
+          <w:p>
+            <w:pPr>
+              <w:spacing w:before="0" w:after="0" w:line="276" w:lineRule="auto"/>
+              <w:jc w:val="center"/>
+            </w:pPr>
+            <w:r/>
+            <w:r>
+              <w:rPr>
+                <w:rFonts w:ascii="Times New Roman" w:hAnsi="Times New Roman"/>
+                <w:b/>
+                <w:i w:val="0"/>
+                <w:color w:val="000000"/>
+                <w:sz w:val="21"/>
+              </w:rPr>
+              <w:t>Roll Number</w:t>
+            </w:r>
+          </w:p>
+        </w:tc>
+        <w:tc>
+          <w:tcPr>
+            <w:tcW w:type="dxa" w:w="3600"/>
+            <w:tcMar>
+              <w:top w:w="70" w:type="dxa"/>
+              <w:bottom w:w="70" w:type="dxa"/>
+              <w:left w:w="120" w:type="dxa"/>
+              <w:right w:w="100" w:type="dxa"/>
+            </w:tcMar>
+          </w:tcPr>
+          <w:p>
+            <w:pPr>
+              <w:spacing w:before="0" w:after="0" w:line="276" w:lineRule="auto"/>
+              <w:jc w:val="left"/>
+            </w:pPr>
+            <w:r/>
+            <w:r>
+              <w:rPr>
+                <w:rFonts w:ascii="Times New Roman" w:hAnsi="Times New Roman"/>
+                <w:b/>
+                <w:i w:val="0"/>
+                <w:color w:val="000000"/>
+                <w:sz w:val="21"/>
+              </w:rPr>
+              <w:t>Name of the Student</w:t>
+            </w:r>
+          </w:p>
+        </w:tc>
+        <w:tc>
+          <w:tcPr>
+            <w:tcW w:type="dxa" w:w="2160"/>
+            <w:tcMar>
+              <w:top w:w="70" w:type="dxa"/>
+              <w:bottom w:w="70" w:type="dxa"/>
+              <w:left w:w="100" w:type="dxa"/>
+              <w:right w:w="100" w:type="dxa"/>
+            </w:tcMar>
+          </w:tcPr>
+          <w:p>
+            <w:pPr>
+              <w:spacing w:before="0" w:after="0" w:line="276" w:lineRule="auto"/>
+              <w:jc w:val="center"/>
+            </w:pPr>
+            <w:r/>
+            <w:r>
+              <w:rPr>
+                <w:rFonts w:ascii="Times New Roman" w:hAnsi="Times New Roman"/>
+                <w:b/>
+                <w:i w:val="0"/>
+                <w:color w:val="000000"/>
+                <w:sz w:val="21"/>
+              </w:rPr>
+              <w:t>Signature</w:t>
+            </w:r>
+          </w:p>
+        </w:tc>
+      </w:tr>
+      <w:tr>
+        <w:tc>
+          <w:tcPr>
+            <w:tcW w:type="dxa" w:w="2880"/>
+            <w:tcMar>
+              <w:top w:w="70" w:type="dxa"/>
+              <w:bottom w:w="70" w:type="dxa"/>
+              <w:left w:w="100" w:type="dxa"/>
+              <w:right w:w="100" w:type="dxa"/>
+            </w:tcMar>
+          </w:tcPr>
+          <w:p>
+            <w:pPr>
+              <w:spacing w:before="0" w:after="0" w:line="276" w:lineRule="auto"/>
+              <w:jc w:val="center"/>
+            </w:pPr>
+            <w:r/>
+            <w:r>
+              <w:rPr>
+                <w:rFonts w:ascii="Times New Roman" w:hAnsi="Times New Roman"/>
+                <w:b/>
+                <w:i w:val="0"/>
+                <w:color w:val="000000"/>
+                <w:sz w:val="20"/>
+              </w:rPr>
+              <w:t>2401100CSE0243</w:t>
+            </w:r>
+          </w:p>
+        </w:tc>
+        <w:tc>
+          <w:tcPr>
+            <w:tcW w:type="dxa" w:w="3600"/>
+            <w:tcMar>
+              <w:top w:w="70" w:type="dxa"/>
+              <w:bottom w:w="70" w:type="dxa"/>
+              <w:left w:w="120" w:type="dxa"/>
+              <w:right w:w="100" w:type="dxa"/>
+            </w:tcMar>
+          </w:tcPr>
+          <w:p>
+            <w:pPr>
+              <w:spacing w:before="0" w:after="0" w:line="276" w:lineRule="auto"/>
+              <w:jc w:val="left"/>
+            </w:pPr>
+            <w:r/>
+            <w:r>
+              <w:rPr>
+                <w:rFonts w:ascii="Times New Roman" w:hAnsi="Times New Roman"/>
+                <w:b w:val="0"/>
+                <w:i w:val="0"/>
+                <w:color w:val="000000"/>
+                <w:sz w:val="20"/>
+              </w:rPr>
+              <w:t>Bojja Sahasra</w:t>
+            </w:r>
+          </w:p>
+        </w:tc>
+        <w:tc>
+          <w:tcPr>
+            <w:tcW w:type="dxa" w:w="2160"/>
+            <w:tcMar>
+              <w:top w:w="70" w:type="dxa"/>
+              <w:bottom w:w="70" w:type="dxa"/>
+              <w:left w:w="100" w:type="dxa"/>
+              <w:right w:w="100" w:type="dxa"/>
+            </w:tcMar>
+          </w:tcPr>
+          <w:p>
+            <w:pPr>
+              <w:spacing w:before="0" w:after="0" w:line="276" w:lineRule="auto"/>
+              <w:jc w:val="center"/>
+            </w:pPr>
+            <w:r/>
+          </w:p>
+        </w:tc>
+      </w:tr>
+      <w:tr>
+        <w:tc>
+          <w:tcPr>
+            <w:tcW w:type="dxa" w:w="2880"/>
+            <w:tcMar>
+              <w:top w:w="70" w:type="dxa"/>
+              <w:bottom w:w="70" w:type="dxa"/>
+              <w:left w:w="100" w:type="dxa"/>
+              <w:right w:w="100" w:type="dxa"/>
+            </w:tcMar>
+          </w:tcPr>
+          <w:p>
+            <w:pPr>
+              <w:spacing w:before="0" w:after="0" w:line="276" w:lineRule="auto"/>
+              <w:jc w:val="center"/>
+            </w:pPr>
+            <w:r/>
+            <w:r>
+              <w:rPr>
+                <w:rFonts w:ascii="Times New Roman" w:hAnsi="Times New Roman"/>
+                <w:b/>
+                <w:i w:val="0"/>
+                <w:color w:val="000000"/>
+                <w:sz w:val="20"/>
+              </w:rPr>
+              <w:t>2401100CSE0264</w:t>
+            </w:r>
+          </w:p>
+        </w:tc>
+        <w:tc>
+          <w:tcPr>
+            <w:tcW w:type="dxa" w:w="3600"/>
+            <w:tcMar>
+              <w:top w:w="70" w:type="dxa"/>
+              <w:bottom w:w="70" w:type="dxa"/>
+              <w:left w:w="120" w:type="dxa"/>
+              <w:right w:w="100" w:type="dxa"/>
+            </w:tcMar>
+          </w:tcPr>
+          <w:p>
+            <w:pPr>
+              <w:spacing w:before="0" w:after="0" w:line="276" w:lineRule="auto"/>
+              <w:jc w:val="left"/>
+            </w:pPr>
+            <w:r/>
+            <w:r>
+              <w:rPr>
+                <w:rFonts w:ascii="Times New Roman" w:hAnsi="Times New Roman"/>
+                <w:b w:val="0"/>
+                <w:i w:val="0"/>
+                <w:color w:val="000000"/>
+                <w:sz w:val="20"/>
+              </w:rPr>
+              <w:t>Mudigonda Lalitha Sreya</w:t>
+            </w:r>
+          </w:p>
+        </w:tc>
+        <w:tc>
+          <w:tcPr>
+            <w:tcW w:type="dxa" w:w="2160"/>
+            <w:tcMar>
+              <w:top w:w="70" w:type="dxa"/>
+              <w:bottom w:w="70" w:type="dxa"/>
+              <w:left w:w="100" w:type="dxa"/>
+              <w:right w:w="100" w:type="dxa"/>
+            </w:tcMar>
+          </w:tcPr>
+          <w:p>
+            <w:pPr>
+              <w:spacing w:before="0" w:after="0" w:line="276" w:lineRule="auto"/>
+              <w:jc w:val="center"/>
+            </w:pPr>
+            <w:r/>
+          </w:p>
+        </w:tc>
+      </w:tr>
+      <w:tr>
+        <w:tc>
+          <w:tcPr>
+            <w:tcW w:type="dxa" w:w="2880"/>
+            <w:tcMar>
+              <w:top w:w="70" w:type="dxa"/>
+              <w:bottom w:w="70" w:type="dxa"/>
+              <w:left w:w="100" w:type="dxa"/>
+              <w:right w:w="100" w:type="dxa"/>
+            </w:tcMar>
+          </w:tcPr>
+          <w:p>
+            <w:pPr>
+              <w:spacing w:before="0" w:after="0" w:line="276" w:lineRule="auto"/>
+              <w:jc w:val="center"/>
+            </w:pPr>
+            <w:r/>
+            <w:r>
+              <w:rPr>
+                <w:rFonts w:ascii="Times New Roman" w:hAnsi="Times New Roman"/>
+                <w:b/>
+                <w:i w:val="0"/>
+                <w:color w:val="000000"/>
+                <w:sz w:val="20"/>
+              </w:rPr>
+              <w:t>2401100CSE0275</w:t>
+            </w:r>
+          </w:p>
+        </w:tc>
+        <w:tc>
+          <w:tcPr>
+            <w:tcW w:type="dxa" w:w="3600"/>
+            <w:tcMar>
+              <w:top w:w="70" w:type="dxa"/>
+              <w:bottom w:w="70" w:type="dxa"/>
+              <w:left w:w="120" w:type="dxa"/>
+              <w:right w:w="100" w:type="dxa"/>
+            </w:tcMar>
+          </w:tcPr>
+          <w:p>
+            <w:pPr>
+              <w:spacing w:before="0" w:after="0" w:line="276" w:lineRule="auto"/>
+              <w:jc w:val="left"/>
+            </w:pPr>
+            <w:r/>
+            <w:r>
+              <w:rPr>
+                <w:rFonts w:ascii="Times New Roman" w:hAnsi="Times New Roman"/>
+                <w:b w:val="0"/>
+                <w:i w:val="0"/>
+                <w:color w:val="000000"/>
+                <w:sz w:val="20"/>
+              </w:rPr>
+              <w:t>Rohan Joshua Francis</w:t>
+            </w:r>
+          </w:p>
+        </w:tc>
+        <w:tc>
+          <w:tcPr>
+            <w:tcW w:type="dxa" w:w="2160"/>
+            <w:tcMar>
+              <w:top w:w="70" w:type="dxa"/>
+              <w:bottom w:w="70" w:type="dxa"/>
+              <w:left w:w="100" w:type="dxa"/>
+              <w:right w:w="100" w:type="dxa"/>
+            </w:tcMar>
+          </w:tcPr>
+          <w:p>
+            <w:pPr>
+              <w:spacing w:before="0" w:after="0" w:line="276" w:lineRule="auto"/>
+              <w:jc w:val="center"/>
+            </w:pPr>
+            <w:r/>
+          </w:p>
+        </w:tc>
+      </w:tr>
+    </w:tbl>
     <w:p>
       <w:pPr>
-        <w:spacing w:before="480" w:line="312" w:lineRule="auto"/>
-      </w:pPr>
-      <w:r>
-        <w:t>Bojja Sahasra (Roll No: 2401100CSE0243)</w:t>
-        <w:br/>
-      </w:r>
-      <w:r>
-        <w:t>Mudigonda Lalitha Sreya (Roll No: 2401100CSE0264)</w:t>
-        <w:br/>
-      </w:r>
-      <w:r>
-        <w:t>Rohan Joshua Francis (Roll No: 2401100CSE0275)</w:t>
-        <w:br/>
-        <w:br/>
-      </w:r>
-      <w:r>
+        <w:spacing w:before="400" w:after="0" w:line="312" w:lineRule="auto"/>
+        <w:jc w:val="left"/>
+      </w:pPr>
+      <w:r>
+        <w:rPr>
+          <w:rFonts w:ascii="Times New Roman" w:hAnsi="Times New Roman"/>
+          <w:sz w:val="21"/>
+        </w:rPr>
         <w:t>Date: October 2026</w:t>
         <w:br/>
         <w:t>Place: Hyderabad</w:t>

</xml_diff>